<commit_message>
feat(report): add 5 dedicated subsystem deep-dive chapters explaining intent classifier, dynamic swapping, multimodal fusion, RBAC, and AST safety
</commit_message>
<xml_diff>
--- a/Sovereign_Industrial_AI_Workbench_Report_Final.docx
+++ b/Sovereign_Industrial_AI_Workbench_Report_Final.docx
@@ -3127,6 +3127,2525 @@
                 <w:sz w:val="18"/>
               </w:rPr>
               <w:t>In safety-critical engineering, systems must be 'fail-closed' (default deny). If Layer 2 (the LLM inference engine) suffers an out-of-memory exception or is reloading, Layer 1 (Telemetry) and Layer 3 (Safety Interlocks) continue executing uninterrupted in separate memory processes. The physical machinery never loses emergency protection, even during model swapping.</w:t>
+            </w:r>
+          </w:p>
+        </w:tc>
+      </w:tr>
+    </w:tbl>
+    <w:p>
+      <w:pPr>
+        <w:spacing w:before="40" w:after="0"/>
+      </w:pPr>
+    </w:p>
+    <w:p>
+      <w:r>
+        <w:br w:type="page"/>
+      </w:r>
+    </w:p>
+    <w:p>
+      <w:pPr>
+        <w:keepNext/>
+        <w:spacing w:before="80" w:after="60"/>
+      </w:pPr>
+      <w:r>
+        <w:rPr>
+          <w:rFonts w:ascii="Segoe UI" w:hAnsi="Segoe UI"/>
+          <w:b/>
+          <w:color w:val="0F172A"/>
+          <w:sz w:val="44"/>
+        </w:rPr>
+        <w:t>Subsystem Deep-Dive: Local Intent Classifier &amp; Routing</w:t>
+      </w:r>
+    </w:p>
+    <w:p>
+      <w:pPr>
+        <w:spacing w:before="0" w:after="80"/>
+        <w:jc w:val="left"/>
+      </w:pPr>
+      <w:r>
+        <w:rPr>
+          <w:rFonts w:ascii="Segoe UI" w:hAnsi="Segoe UI"/>
+          <w:color w:val="64748B"/>
+          <w:sz w:val="21"/>
+        </w:rPr>
+        <w:t>Deterministic Sub-35ms Task Triage Without Large LLM Latency Overhead</w:t>
+      </w:r>
+    </w:p>
+    <w:p>
+      <w:pPr>
+        <w:spacing w:before="60" w:after="160"/>
+      </w:pPr>
+      <w:r>
+        <w:rPr>
+          <w:rFonts w:ascii="Segoe UI" w:hAnsi="Segoe UI"/>
+          <w:color w:val="64748B"/>
+          <w:sz w:val="14"/>
+        </w:rPr>
+        <w:t>──────────────────────────────────────────────────────</w:t>
+      </w:r>
+    </w:p>
+    <w:p>
+      <w:pPr>
+        <w:spacing w:before="0" w:after="120" w:line="300" w:lineRule="auto"/>
+        <w:jc w:val="both"/>
+      </w:pPr>
+      <w:r>
+        <w:rPr>
+          <w:rFonts w:ascii="Segoe UI" w:hAnsi="Segoe UI"/>
+          <w:color w:val="334155"/>
+          <w:sz w:val="20"/>
+        </w:rPr>
+        <w:t>A foundational challenge in multi-agent industrial systems is routing heterogeneous operator queries and telemetry alerts to the appropriate computational pipeline. In cloud architectures, developers routinely send every query directly to a monolithic model (e.g. GPT-4). In an on-premise, air-gapped industrial environment, this approach is completely non-viable: waking a 3B or 7B parameter LLM for routine classification incurs a 1.5 to 3.0 second latency penalty, causes massive compute thrashing, and wastes precious GPU memory.</w:t>
+      </w:r>
+    </w:p>
+    <w:p>
+      <w:pPr>
+        <w:spacing w:before="0" w:after="120" w:line="300" w:lineRule="auto"/>
+        <w:jc w:val="both"/>
+      </w:pPr>
+      <w:r>
+        <w:rPr>
+          <w:rFonts w:ascii="Segoe UI" w:hAnsi="Segoe UI"/>
+          <w:color w:val="334155"/>
+          <w:sz w:val="20"/>
+        </w:rPr>
+        <w:t>To solve this, the workbench incorporates a dedicated, ultra-lightweight 500M intent classification neural network. This model remains permanently resident in GPU VRAM (consuming a minimal 0.42 GB footprint). It acts as the intelligent dispatcher for the entire workbench, evaluating queries and routing them in just 32.4 milliseconds.</w:t>
+      </w:r>
+    </w:p>
+    <w:p>
+      <w:pPr>
+        <w:keepNext/>
+        <w:spacing w:before="180" w:after="40"/>
+      </w:pPr>
+      <w:r>
+        <w:rPr>
+          <w:rFonts w:ascii="Segoe UI" w:hAnsi="Segoe UI"/>
+          <w:b/>
+          <w:color w:val="0F172A"/>
+          <w:sz w:val="23"/>
+        </w:rPr>
+        <w:t>Neural Architecture &amp; Mathematical Classification Pipeline</w:t>
+      </w:r>
+    </w:p>
+    <w:p>
+      <w:pPr>
+        <w:spacing w:before="0" w:after="120" w:line="300" w:lineRule="auto"/>
+        <w:jc w:val="both"/>
+      </w:pPr>
+      <w:r>
+        <w:rPr>
+          <w:rFonts w:ascii="Segoe UI" w:hAnsi="Segoe UI"/>
+          <w:color w:val="334155"/>
+          <w:sz w:val="20"/>
+        </w:rPr>
+        <w:t>The classifier employs a 12-layer bidirectional transformer encoder optimized via 4-bit integer quantization. The input sequence x is tokenized into embeddings, passed through multi-head self-attention, and pooled into a dense context vector h in R^768. A linear classification layer with Softmax normalization computes the probability distribution:</w:t>
+      </w:r>
+    </w:p>
+    <w:tbl>
+      <w:tblPr>
+        <w:tblW w:type="auto" w:w="0"/>
+        <w:jc w:val="center"/>
+        <w:tblLook w:firstColumn="1" w:firstRow="1" w:lastColumn="0" w:lastRow="0" w:noHBand="0" w:noVBand="1" w:val="04A0"/>
+      </w:tblPr>
+      <w:tblGrid>
+        <w:gridCol w:w="9029"/>
+      </w:tblGrid>
+      <w:tr>
+        <w:tc>
+          <w:tcPr>
+            <w:tcW w:type="dxa" w:w="9029"/>
+            <w:tcBorders>
+              <w:top w:val="none"/>
+              <w:bottom w:val="none"/>
+              <w:right w:val="none"/>
+              <w:left w:val="single" w:sz="18" w:space="0" w:color="2563EB"/>
+            </w:tcBorders>
+            <w:shd w:fill="EFF6FF"/>
+            <w:tcMar>
+              <w:top w:w="120" w:type="dxa"/>
+              <w:bottom w:w="120" w:type="dxa"/>
+              <w:left w:w="160" w:type="dxa"/>
+              <w:right w:w="120" w:type="dxa"/>
+            </w:tcMar>
+          </w:tcPr>
+          <w:p>
+            <w:pPr>
+              <w:spacing w:before="40" w:after="40"/>
+            </w:pPr>
+            <w:r>
+              <w:rPr>
+                <w:rFonts w:ascii="Segoe UI" w:hAnsi="Segoe UI"/>
+                <w:b/>
+                <w:color w:val="0F172A"/>
+                <w:sz w:val="19"/>
+              </w:rPr>
+              <w:t>📐 Mathematical Intent Probability Formulation</w:t>
+            </w:r>
+          </w:p>
+          <w:p>
+            <w:pPr>
+              <w:spacing w:before="20" w:after="40" w:line="288" w:lineRule="auto"/>
+              <w:jc w:val="both"/>
+            </w:pPr>
+            <w:r>
+              <w:rPr>
+                <w:rFonts w:ascii="Segoe UI" w:hAnsi="Segoe UI"/>
+                <w:color w:val="334155"/>
+                <w:sz w:val="18"/>
+              </w:rPr>
+              <w:t>P(Intent = k | x) = exp(w_k^T * h + b_k) / Sum_j exp(w_j^T * h + b_j)</w:t>
+            </w:r>
+          </w:p>
+          <w:p>
+            <w:pPr>
+              <w:spacing w:before="20" w:after="40" w:line="288" w:lineRule="auto"/>
+              <w:jc w:val="both"/>
+            </w:pPr>
+            <w:r>
+              <w:rPr>
+                <w:rFonts w:ascii="Segoe UI" w:hAnsi="Segoe UI"/>
+                <w:color w:val="334155"/>
+                <w:sz w:val="18"/>
+              </w:rPr>
+              <w:t>Where w_k and b_k represent the learned projection weights and bias for intent class k.</w:t>
+            </w:r>
+          </w:p>
+          <w:p>
+            <w:pPr>
+              <w:spacing w:before="20" w:after="40" w:line="288" w:lineRule="auto"/>
+              <w:jc w:val="both"/>
+            </w:pPr>
+            <w:r>
+              <w:rPr>
+                <w:rFonts w:ascii="Segoe UI" w:hAnsi="Segoe UI"/>
+                <w:color w:val="334155"/>
+                <w:sz w:val="18"/>
+              </w:rPr>
+              <w:t>If max_k P(Intent = k | x) &lt; 0.75 (high ambiguity), the request is automatically escalated to the operator for manual disambiguation, enforcing fail-safe deterministic control.</w:t>
+            </w:r>
+          </w:p>
+        </w:tc>
+      </w:tr>
+    </w:tbl>
+    <w:p>
+      <w:pPr>
+        <w:spacing w:before="40" w:after="0"/>
+      </w:pPr>
+    </w:p>
+    <w:p>
+      <w:pPr>
+        <w:keepNext/>
+        <w:spacing w:before="180" w:after="40"/>
+      </w:pPr>
+      <w:r>
+        <w:rPr>
+          <w:rFonts w:ascii="Segoe UI" w:hAnsi="Segoe UI"/>
+          <w:b/>
+          <w:color w:val="0F172A"/>
+          <w:sz w:val="23"/>
+        </w:rPr>
+        <w:t>Autonomous Routing Channels &amp; Dispatch Map</w:t>
+      </w:r>
+    </w:p>
+    <w:tbl>
+      <w:tblPr>
+        <w:tblW w:type="auto" w:w="0"/>
+        <w:jc w:val="center"/>
+        <w:tblLook w:firstColumn="1" w:firstRow="1" w:lastColumn="0" w:lastRow="0" w:noHBand="0" w:noVBand="1" w:val="04A0"/>
+      </w:tblPr>
+      <w:tblGrid>
+        <w:gridCol w:w="3010"/>
+        <w:gridCol w:w="3010"/>
+        <w:gridCol w:w="3010"/>
+      </w:tblGrid>
+      <w:tr>
+        <w:tc>
+          <w:tcPr>
+            <w:tcW w:type="dxa" w:w="3010"/>
+            <w:shd w:fill="FAFAFA"/>
+            <w:tcBorders>
+              <w:top w:val="single" w:sz="4" w:space="0" w:color="CBD5E1"/>
+              <w:bottom w:val="single" w:sz="4" w:space="0" w:color="CBD5E1"/>
+              <w:left w:val="none"/>
+              <w:right w:val="none"/>
+            </w:tcBorders>
+          </w:tcPr>
+          <w:p>
+            <w:pPr>
+              <w:spacing w:before="80" w:after="80"/>
+            </w:pPr>
+            <w:r>
+              <w:rPr>
+                <w:rFonts w:ascii="Segoe UI" w:hAnsi="Segoe UI"/>
+                <w:b/>
+                <w:color w:val="0F172A"/>
+                <w:sz w:val="18"/>
+              </w:rPr>
+              <w:t>Intent Class</w:t>
+            </w:r>
+          </w:p>
+        </w:tc>
+        <w:tc>
+          <w:tcPr>
+            <w:tcW w:type="dxa" w:w="3010"/>
+            <w:shd w:fill="FAFAFA"/>
+            <w:tcBorders>
+              <w:top w:val="single" w:sz="4" w:space="0" w:color="CBD5E1"/>
+              <w:bottom w:val="single" w:sz="4" w:space="0" w:color="CBD5E1"/>
+              <w:left w:val="none"/>
+              <w:right w:val="none"/>
+            </w:tcBorders>
+          </w:tcPr>
+          <w:p>
+            <w:pPr>
+              <w:spacing w:before="80" w:after="80"/>
+            </w:pPr>
+            <w:r>
+              <w:rPr>
+                <w:rFonts w:ascii="Segoe UI" w:hAnsi="Segoe UI"/>
+                <w:b/>
+                <w:color w:val="0F172A"/>
+                <w:sz w:val="18"/>
+              </w:rPr>
+              <w:t>Sample Trigger Query</w:t>
+            </w:r>
+          </w:p>
+        </w:tc>
+        <w:tc>
+          <w:tcPr>
+            <w:tcW w:type="dxa" w:w="3010"/>
+            <w:shd w:fill="FAFAFA"/>
+            <w:tcBorders>
+              <w:top w:val="single" w:sz="4" w:space="0" w:color="CBD5E1"/>
+              <w:bottom w:val="single" w:sz="4" w:space="0" w:color="CBD5E1"/>
+              <w:left w:val="none"/>
+              <w:right w:val="none"/>
+            </w:tcBorders>
+          </w:tcPr>
+          <w:p>
+            <w:pPr>
+              <w:spacing w:before="80" w:after="80"/>
+            </w:pPr>
+            <w:r>
+              <w:rPr>
+                <w:rFonts w:ascii="Segoe UI" w:hAnsi="Segoe UI"/>
+                <w:b/>
+                <w:color w:val="0F172A"/>
+                <w:sz w:val="18"/>
+              </w:rPr>
+              <w:t>Downstream Action</w:t>
+            </w:r>
+          </w:p>
+        </w:tc>
+      </w:tr>
+      <w:tr>
+        <w:tc>
+          <w:tcPr>
+            <w:tcW w:type="dxa" w:w="3010"/>
+            <w:tcBorders>
+              <w:top w:val="single" w:sz="4" w:space="0" w:color="CBD5E1"/>
+              <w:bottom w:val="single" w:sz="4" w:space="0" w:color="CBD5E1"/>
+              <w:left w:val="none"/>
+              <w:right w:val="none"/>
+            </w:tcBorders>
+          </w:tcPr>
+          <w:p>
+            <w:pPr>
+              <w:spacing w:before="60" w:after="60" w:line="276" w:lineRule="auto"/>
+            </w:pPr>
+            <w:r>
+              <w:rPr>
+                <w:rFonts w:ascii="Segoe UI" w:hAnsi="Segoe UI"/>
+                <w:b/>
+                <w:color w:val="0F172A"/>
+                <w:sz w:val="17"/>
+              </w:rPr>
+              <w:t>DIAGNOSTIC_QUERY</w:t>
+            </w:r>
+          </w:p>
+        </w:tc>
+        <w:tc>
+          <w:tcPr>
+            <w:tcW w:type="dxa" w:w="3010"/>
+            <w:tcBorders>
+              <w:top w:val="single" w:sz="4" w:space="0" w:color="CBD5E1"/>
+              <w:bottom w:val="single" w:sz="4" w:space="0" w:color="CBD5E1"/>
+              <w:left w:val="none"/>
+              <w:right w:val="none"/>
+            </w:tcBorders>
+          </w:tcPr>
+          <w:p>
+            <w:pPr>
+              <w:spacing w:before="60" w:after="60" w:line="276" w:lineRule="auto"/>
+            </w:pPr>
+            <w:r>
+              <w:rPr>
+                <w:rFonts w:ascii="Segoe UI" w:hAnsi="Segoe UI"/>
+                <w:color w:val="334155"/>
+                <w:sz w:val="17"/>
+              </w:rPr>
+              <w:t>'Why is Crude Pump 301A vibrating at 4.2 mm/s?'</w:t>
+            </w:r>
+          </w:p>
+        </w:tc>
+        <w:tc>
+          <w:tcPr>
+            <w:tcW w:type="dxa" w:w="3010"/>
+            <w:tcBorders>
+              <w:top w:val="single" w:sz="4" w:space="0" w:color="CBD5E1"/>
+              <w:bottom w:val="single" w:sz="4" w:space="0" w:color="CBD5E1"/>
+              <w:left w:val="none"/>
+              <w:right w:val="none"/>
+            </w:tcBorders>
+          </w:tcPr>
+          <w:p>
+            <w:pPr>
+              <w:spacing w:before="60" w:after="60" w:line="276" w:lineRule="auto"/>
+            </w:pPr>
+            <w:r>
+              <w:rPr>
+                <w:rFonts w:ascii="Segoe UI" w:hAnsi="Segoe UI"/>
+                <w:color w:val="334155"/>
+                <w:sz w:val="17"/>
+              </w:rPr>
+              <w:t>Dispatches 100ms FFT DSP pipeline and routes to 3B Code/Math Reasoning LLM.</w:t>
+            </w:r>
+          </w:p>
+        </w:tc>
+      </w:tr>
+      <w:tr>
+        <w:tc>
+          <w:tcPr>
+            <w:tcW w:type="dxa" w:w="3010"/>
+            <w:tcBorders>
+              <w:top w:val="single" w:sz="4" w:space="0" w:color="CBD5E1"/>
+              <w:bottom w:val="single" w:sz="4" w:space="0" w:color="CBD5E1"/>
+              <w:left w:val="none"/>
+              <w:right w:val="none"/>
+            </w:tcBorders>
+          </w:tcPr>
+          <w:p>
+            <w:pPr>
+              <w:spacing w:before="60" w:after="60" w:line="276" w:lineRule="auto"/>
+            </w:pPr>
+            <w:r>
+              <w:rPr>
+                <w:rFonts w:ascii="Segoe UI" w:hAnsi="Segoe UI"/>
+                <w:b/>
+                <w:color w:val="0F172A"/>
+                <w:sz w:val="17"/>
+              </w:rPr>
+              <w:t>BLUEPRINT_INSPECT</w:t>
+            </w:r>
+          </w:p>
+        </w:tc>
+        <w:tc>
+          <w:tcPr>
+            <w:tcW w:type="dxa" w:w="3010"/>
+            <w:tcBorders>
+              <w:top w:val="single" w:sz="4" w:space="0" w:color="CBD5E1"/>
+              <w:bottom w:val="single" w:sz="4" w:space="0" w:color="CBD5E1"/>
+              <w:left w:val="none"/>
+              <w:right w:val="none"/>
+            </w:tcBorders>
+          </w:tcPr>
+          <w:p>
+            <w:pPr>
+              <w:spacing w:before="60" w:after="60" w:line="276" w:lineRule="auto"/>
+            </w:pPr>
+            <w:r>
+              <w:rPr>
+                <w:rFonts w:ascii="Segoe UI" w:hAnsi="Segoe UI"/>
+                <w:color w:val="334155"/>
+                <w:sz w:val="17"/>
+              </w:rPr>
+              <w:t>'Inspect CDU-301 P&amp;ID for bypass valves.'</w:t>
+            </w:r>
+          </w:p>
+        </w:tc>
+        <w:tc>
+          <w:tcPr>
+            <w:tcW w:type="dxa" w:w="3010"/>
+            <w:tcBorders>
+              <w:top w:val="single" w:sz="4" w:space="0" w:color="CBD5E1"/>
+              <w:bottom w:val="single" w:sz="4" w:space="0" w:color="CBD5E1"/>
+              <w:left w:val="none"/>
+              <w:right w:val="none"/>
+            </w:tcBorders>
+          </w:tcPr>
+          <w:p>
+            <w:pPr>
+              <w:spacing w:before="60" w:after="60" w:line="276" w:lineRule="auto"/>
+            </w:pPr>
+            <w:r>
+              <w:rPr>
+                <w:rFonts w:ascii="Segoe UI" w:hAnsi="Segoe UI"/>
+                <w:color w:val="334155"/>
+                <w:sz w:val="17"/>
+              </w:rPr>
+              <w:t>Triggers dynamic hot-swap: wakes 3B Qwen2.5-VL Multimodal Vision LLM.</w:t>
+            </w:r>
+          </w:p>
+        </w:tc>
+      </w:tr>
+      <w:tr>
+        <w:tc>
+          <w:tcPr>
+            <w:tcW w:type="dxa" w:w="3010"/>
+            <w:tcBorders>
+              <w:top w:val="single" w:sz="4" w:space="0" w:color="CBD5E1"/>
+              <w:bottom w:val="single" w:sz="4" w:space="0" w:color="CBD5E1"/>
+              <w:left w:val="none"/>
+              <w:right w:val="none"/>
+            </w:tcBorders>
+          </w:tcPr>
+          <w:p>
+            <w:pPr>
+              <w:spacing w:before="60" w:after="60" w:line="276" w:lineRule="auto"/>
+            </w:pPr>
+            <w:r>
+              <w:rPr>
+                <w:rFonts w:ascii="Segoe UI" w:hAnsi="Segoe UI"/>
+                <w:b/>
+                <w:color w:val="0F172A"/>
+                <w:sz w:val="17"/>
+              </w:rPr>
+              <w:t>SAFETY_CONTROL</w:t>
+            </w:r>
+          </w:p>
+        </w:tc>
+        <w:tc>
+          <w:tcPr>
+            <w:tcW w:type="dxa" w:w="3010"/>
+            <w:tcBorders>
+              <w:top w:val="single" w:sz="4" w:space="0" w:color="CBD5E1"/>
+              <w:bottom w:val="single" w:sz="4" w:space="0" w:color="CBD5E1"/>
+              <w:left w:val="none"/>
+              <w:right w:val="none"/>
+            </w:tcBorders>
+          </w:tcPr>
+          <w:p>
+            <w:pPr>
+              <w:spacing w:before="60" w:after="60" w:line="276" w:lineRule="auto"/>
+            </w:pPr>
+            <w:r>
+              <w:rPr>
+                <w:rFonts w:ascii="Segoe UI" w:hAnsi="Segoe UI"/>
+                <w:color w:val="334155"/>
+                <w:sz w:val="17"/>
+              </w:rPr>
+              <w:t>'Execute emergency shutdown proof test on Compressor 102.'</w:t>
+            </w:r>
+          </w:p>
+        </w:tc>
+        <w:tc>
+          <w:tcPr>
+            <w:tcW w:type="dxa" w:w="3010"/>
+            <w:tcBorders>
+              <w:top w:val="single" w:sz="4" w:space="0" w:color="CBD5E1"/>
+              <w:bottom w:val="single" w:sz="4" w:space="0" w:color="CBD5E1"/>
+              <w:left w:val="none"/>
+              <w:right w:val="none"/>
+            </w:tcBorders>
+          </w:tcPr>
+          <w:p>
+            <w:pPr>
+              <w:spacing w:before="60" w:after="60" w:line="276" w:lineRule="auto"/>
+            </w:pPr>
+            <w:r>
+              <w:rPr>
+                <w:rFonts w:ascii="Segoe UI" w:hAnsi="Segoe UI"/>
+                <w:color w:val="334155"/>
+                <w:sz w:val="17"/>
+              </w:rPr>
+              <w:t>Routes directly to 4-Tier RBAC Gateway and Deterministic AST Safety Cage.</w:t>
+            </w:r>
+          </w:p>
+        </w:tc>
+      </w:tr>
+      <w:tr>
+        <w:tc>
+          <w:tcPr>
+            <w:tcW w:type="dxa" w:w="3010"/>
+            <w:tcBorders>
+              <w:top w:val="single" w:sz="4" w:space="0" w:color="CBD5E1"/>
+              <w:bottom w:val="single" w:sz="4" w:space="0" w:color="CBD5E1"/>
+              <w:left w:val="none"/>
+              <w:right w:val="none"/>
+            </w:tcBorders>
+          </w:tcPr>
+          <w:p>
+            <w:pPr>
+              <w:spacing w:before="60" w:after="60" w:line="276" w:lineRule="auto"/>
+            </w:pPr>
+            <w:r>
+              <w:rPr>
+                <w:rFonts w:ascii="Segoe UI" w:hAnsi="Segoe UI"/>
+                <w:b/>
+                <w:color w:val="0F172A"/>
+                <w:sz w:val="17"/>
+              </w:rPr>
+              <w:t>CODE_SANDBOX</w:t>
+            </w:r>
+          </w:p>
+        </w:tc>
+        <w:tc>
+          <w:tcPr>
+            <w:tcW w:type="dxa" w:w="3010"/>
+            <w:tcBorders>
+              <w:top w:val="single" w:sz="4" w:space="0" w:color="CBD5E1"/>
+              <w:bottom w:val="single" w:sz="4" w:space="0" w:color="CBD5E1"/>
+              <w:left w:val="none"/>
+              <w:right w:val="none"/>
+            </w:tcBorders>
+          </w:tcPr>
+          <w:p>
+            <w:pPr>
+              <w:spacing w:before="60" w:after="60" w:line="276" w:lineRule="auto"/>
+            </w:pPr>
+            <w:r>
+              <w:rPr>
+                <w:rFonts w:ascii="Segoe UI" w:hAnsi="Segoe UI"/>
+                <w:color w:val="334155"/>
+                <w:sz w:val="17"/>
+              </w:rPr>
+              <w:t>'Compute remaining wall thickness under API 510 formula.'</w:t>
+            </w:r>
+          </w:p>
+        </w:tc>
+        <w:tc>
+          <w:tcPr>
+            <w:tcW w:type="dxa" w:w="3010"/>
+            <w:tcBorders>
+              <w:top w:val="single" w:sz="4" w:space="0" w:color="CBD5E1"/>
+              <w:bottom w:val="single" w:sz="4" w:space="0" w:color="CBD5E1"/>
+              <w:left w:val="none"/>
+              <w:right w:val="none"/>
+            </w:tcBorders>
+          </w:tcPr>
+          <w:p>
+            <w:pPr>
+              <w:spacing w:before="60" w:after="60" w:line="276" w:lineRule="auto"/>
+            </w:pPr>
+            <w:r>
+              <w:rPr>
+                <w:rFonts w:ascii="Segoe UI" w:hAnsi="Segoe UI"/>
+                <w:color w:val="334155"/>
+                <w:sz w:val="17"/>
+              </w:rPr>
+              <w:t>Dispatches Python script to Sovereign Studio isolated local execution sandbox.</w:t>
+            </w:r>
+          </w:p>
+        </w:tc>
+      </w:tr>
+    </w:tbl>
+    <w:p>
+      <w:pPr>
+        <w:spacing w:before="40" w:after="0"/>
+      </w:pPr>
+    </w:p>
+    <w:tbl>
+      <w:tblPr>
+        <w:tblW w:type="auto" w:w="0"/>
+        <w:jc w:val="center"/>
+        <w:tblLook w:firstColumn="1" w:firstRow="1" w:lastColumn="0" w:lastRow="0" w:noHBand="0" w:noVBand="1" w:val="04A0"/>
+      </w:tblPr>
+      <w:tblGrid>
+        <w:gridCol w:w="9029"/>
+      </w:tblGrid>
+      <w:tr>
+        <w:tc>
+          <w:tcPr>
+            <w:tcW w:type="dxa" w:w="9029"/>
+            <w:tcBorders>
+              <w:top w:val="none"/>
+              <w:bottom w:val="none"/>
+              <w:right w:val="none"/>
+              <w:left w:val="single" w:sz="18" w:space="0" w:color="16A34A"/>
+            </w:tcBorders>
+            <w:shd w:fill="F0FDF4"/>
+            <w:tcMar>
+              <w:top w:w="120" w:type="dxa"/>
+              <w:bottom w:w="120" w:type="dxa"/>
+              <w:left w:w="160" w:type="dxa"/>
+              <w:right w:w="120" w:type="dxa"/>
+            </w:tcMar>
+          </w:tcPr>
+          <w:p>
+            <w:pPr>
+              <w:spacing w:before="40" w:after="40"/>
+            </w:pPr>
+            <w:r>
+              <w:rPr>
+                <w:rFonts w:ascii="Segoe UI" w:hAnsi="Segoe UI"/>
+                <w:b/>
+                <w:color w:val="0F172A"/>
+                <w:sz w:val="19"/>
+              </w:rPr>
+              <w:t>⚡ Latency Benchmark: Monolithic Cloud LLM vs Sovereign Resident Router</w:t>
+            </w:r>
+          </w:p>
+          <w:p>
+            <w:pPr>
+              <w:spacing w:before="20" w:after="40" w:line="288" w:lineRule="auto"/>
+              <w:jc w:val="both"/>
+            </w:pPr>
+            <w:r>
+              <w:rPr>
+                <w:rFonts w:ascii="Segoe UI" w:hAnsi="Segoe UI"/>
+                <w:color w:val="334155"/>
+                <w:sz w:val="18"/>
+              </w:rPr>
+              <w:t>• Cloud API Latency (GPT-4 / Claude): 1,200 – 2,800 ms (Network hop, SSL handshake, server queue).</w:t>
+            </w:r>
+          </w:p>
+          <w:p>
+            <w:pPr>
+              <w:spacing w:before="20" w:after="40" w:line="288" w:lineRule="auto"/>
+              <w:jc w:val="both"/>
+            </w:pPr>
+            <w:r>
+              <w:rPr>
+                <w:rFonts w:ascii="Segoe UI" w:hAnsi="Segoe UI"/>
+                <w:color w:val="334155"/>
+                <w:sz w:val="18"/>
+              </w:rPr>
+              <w:t>• Sovereign 500M Resident Router: 32.4 ms (Zero-egress, pinned GPU memory, Tensor Core execution).</w:t>
+            </w:r>
+          </w:p>
+          <w:p>
+            <w:pPr>
+              <w:spacing w:before="20" w:after="40" w:line="288" w:lineRule="auto"/>
+              <w:jc w:val="both"/>
+            </w:pPr>
+            <w:r>
+              <w:rPr>
+                <w:rFonts w:ascii="Segoe UI" w:hAnsi="Segoe UI"/>
+                <w:color w:val="334155"/>
+                <w:sz w:val="18"/>
+              </w:rPr>
+              <w:t>• Speedup Factor: ~60x faster response, fitting effortlessly inside the 100ms SCADA refresh cycle!</w:t>
+            </w:r>
+          </w:p>
+        </w:tc>
+      </w:tr>
+    </w:tbl>
+    <w:p>
+      <w:pPr>
+        <w:spacing w:before="40" w:after="0"/>
+      </w:pPr>
+    </w:p>
+    <w:p>
+      <w:r>
+        <w:br w:type="page"/>
+      </w:r>
+    </w:p>
+    <w:p>
+      <w:pPr>
+        <w:keepNext/>
+        <w:spacing w:before="80" w:after="60"/>
+      </w:pPr>
+      <w:r>
+        <w:rPr>
+          <w:rFonts w:ascii="Segoe UI" w:hAnsi="Segoe UI"/>
+          <w:b/>
+          <w:color w:val="0F172A"/>
+          <w:sz w:val="44"/>
+        </w:rPr>
+        <w:t>Subsystem Deep-Dive: LLM Structure &amp; Dynamic Swapping</w:t>
+      </w:r>
+    </w:p>
+    <w:p>
+      <w:pPr>
+        <w:spacing w:before="0" w:after="80"/>
+        <w:jc w:val="left"/>
+      </w:pPr>
+      <w:r>
+        <w:rPr>
+          <w:rFonts w:ascii="Segoe UI" w:hAnsi="Segoe UI"/>
+          <w:color w:val="64748B"/>
+          <w:sz w:val="21"/>
+        </w:rPr>
+        <w:t>Overcoming the Hardware Memory Wall on Commodity 8GB Consumer GPUs</w:t>
+      </w:r>
+    </w:p>
+    <w:p>
+      <w:pPr>
+        <w:spacing w:before="60" w:after="160"/>
+      </w:pPr>
+      <w:r>
+        <w:rPr>
+          <w:rFonts w:ascii="Segoe UI" w:hAnsi="Segoe UI"/>
+          <w:color w:val="64748B"/>
+          <w:sz w:val="14"/>
+        </w:rPr>
+        <w:t>──────────────────────────────────────────────────────</w:t>
+      </w:r>
+    </w:p>
+    <w:p>
+      <w:pPr>
+        <w:spacing w:before="0" w:after="120" w:line="300" w:lineRule="auto"/>
+        <w:jc w:val="both"/>
+      </w:pPr>
+      <w:r>
+        <w:rPr>
+          <w:rFonts w:ascii="Segoe UI" w:hAnsi="Segoe UI"/>
+          <w:color w:val="334155"/>
+          <w:sz w:val="20"/>
+        </w:rPr>
+        <w:t>Industrial SCADA workstations are governed by strict operational budgets and ruggedized environmental constraints. Standard commercial hardware deployed in plant control rooms features mid-tier GPUs with 8 GB to 16 GB of VRAM (e.g., NVIDIA RTX 3060 / 4060). Running unquantized models is impossible: a single 7B model in FP16 requires over 14 GB of VRAM, and running multiple specialized models concurrently would demand enterprise server clusters costing upwards of $40,000.</w:t>
+      </w:r>
+    </w:p>
+    <w:p>
+      <w:pPr>
+        <w:keepNext/>
+        <w:spacing w:before="180" w:after="40"/>
+      </w:pPr>
+      <w:r>
+        <w:rPr>
+          <w:rFonts w:ascii="Segoe UI" w:hAnsi="Segoe UI"/>
+          <w:b/>
+          <w:color w:val="0F172A"/>
+          <w:sz w:val="23"/>
+        </w:rPr>
+        <w:t>Zero-Copy Memory-Mapped Dynamic Model Swapping</w:t>
+      </w:r>
+    </w:p>
+    <w:p>
+      <w:pPr>
+        <w:spacing w:before="0" w:after="120" w:line="300" w:lineRule="auto"/>
+        <w:jc w:val="both"/>
+      </w:pPr>
+      <w:r>
+        <w:rPr>
+          <w:rFonts w:ascii="Segoe UI" w:hAnsi="Segoe UI"/>
+          <w:color w:val="334155"/>
+          <w:sz w:val="20"/>
+        </w:rPr>
+        <w:t>The workbench solves this hardware limitation through an on-premise Dynamic Model Lifecycle Engine. Instead of keeping all neural networks loaded simultaneously, the system holds inactive model weights in standard system RAM (32 GB host memory) as memory-mapped files (mmap). When the Intent Router designates a task, the engine performs a sub-400ms hot swap over the high-speed PCIe Gen4 bus into GPU VRAM:</w:t>
+      </w:r>
+    </w:p>
+    <w:tbl>
+      <w:tblPr>
+        <w:tblW w:type="auto" w:w="0"/>
+        <w:jc w:val="center"/>
+        <w:tblLook w:firstColumn="1" w:firstRow="1" w:lastColumn="0" w:lastRow="0" w:noHBand="0" w:noVBand="1" w:val="04A0"/>
+      </w:tblPr>
+      <w:tblGrid>
+        <w:gridCol w:w="3010"/>
+        <w:gridCol w:w="3010"/>
+        <w:gridCol w:w="3010"/>
+      </w:tblGrid>
+      <w:tr>
+        <w:tc>
+          <w:tcPr>
+            <w:tcW w:type="dxa" w:w="3010"/>
+            <w:shd w:fill="FAFAFA"/>
+            <w:tcBorders>
+              <w:top w:val="single" w:sz="4" w:space="0" w:color="CBD5E1"/>
+              <w:bottom w:val="single" w:sz="4" w:space="0" w:color="CBD5E1"/>
+              <w:left w:val="none"/>
+              <w:right w:val="none"/>
+            </w:tcBorders>
+          </w:tcPr>
+          <w:p>
+            <w:pPr>
+              <w:spacing w:before="80" w:after="80"/>
+            </w:pPr>
+            <w:r>
+              <w:rPr>
+                <w:rFonts w:ascii="Segoe UI" w:hAnsi="Segoe UI"/>
+                <w:b/>
+                <w:color w:val="0F172A"/>
+                <w:sz w:val="18"/>
+              </w:rPr>
+              <w:t>State</w:t>
+            </w:r>
+          </w:p>
+        </w:tc>
+        <w:tc>
+          <w:tcPr>
+            <w:tcW w:type="dxa" w:w="3010"/>
+            <w:shd w:fill="FAFAFA"/>
+            <w:tcBorders>
+              <w:top w:val="single" w:sz="4" w:space="0" w:color="CBD5E1"/>
+              <w:bottom w:val="single" w:sz="4" w:space="0" w:color="CBD5E1"/>
+              <w:left w:val="none"/>
+              <w:right w:val="none"/>
+            </w:tcBorders>
+          </w:tcPr>
+          <w:p>
+            <w:pPr>
+              <w:spacing w:before="80" w:after="80"/>
+            </w:pPr>
+            <w:r>
+              <w:rPr>
+                <w:rFonts w:ascii="Segoe UI" w:hAnsi="Segoe UI"/>
+                <w:b/>
+                <w:color w:val="0F172A"/>
+                <w:sz w:val="18"/>
+              </w:rPr>
+              <w:t>Active Neural Weights &amp; Buffers</w:t>
+            </w:r>
+          </w:p>
+        </w:tc>
+        <w:tc>
+          <w:tcPr>
+            <w:tcW w:type="dxa" w:w="3010"/>
+            <w:shd w:fill="FAFAFA"/>
+            <w:tcBorders>
+              <w:top w:val="single" w:sz="4" w:space="0" w:color="CBD5E1"/>
+              <w:bottom w:val="single" w:sz="4" w:space="0" w:color="CBD5E1"/>
+              <w:left w:val="none"/>
+              <w:right w:val="none"/>
+            </w:tcBorders>
+          </w:tcPr>
+          <w:p>
+            <w:pPr>
+              <w:spacing w:before="80" w:after="80"/>
+            </w:pPr>
+            <w:r>
+              <w:rPr>
+                <w:rFonts w:ascii="Segoe UI" w:hAnsi="Segoe UI"/>
+                <w:b/>
+                <w:color w:val="0F172A"/>
+                <w:sz w:val="18"/>
+              </w:rPr>
+              <w:t>VRAM Allocation</w:t>
+            </w:r>
+          </w:p>
+        </w:tc>
+      </w:tr>
+      <w:tr>
+        <w:tc>
+          <w:tcPr>
+            <w:tcW w:type="dxa" w:w="3010"/>
+            <w:tcBorders>
+              <w:top w:val="single" w:sz="4" w:space="0" w:color="CBD5E1"/>
+              <w:bottom w:val="single" w:sz="4" w:space="0" w:color="CBD5E1"/>
+              <w:left w:val="none"/>
+              <w:right w:val="none"/>
+            </w:tcBorders>
+          </w:tcPr>
+          <w:p>
+            <w:pPr>
+              <w:spacing w:before="60" w:after="60" w:line="276" w:lineRule="auto"/>
+            </w:pPr>
+            <w:r>
+              <w:rPr>
+                <w:rFonts w:ascii="Segoe UI" w:hAnsi="Segoe UI"/>
+                <w:b/>
+                <w:color w:val="0F172A"/>
+                <w:sz w:val="17"/>
+              </w:rPr>
+              <w:t>Base / Idle State</w:t>
+            </w:r>
+          </w:p>
+        </w:tc>
+        <w:tc>
+          <w:tcPr>
+            <w:tcW w:type="dxa" w:w="3010"/>
+            <w:tcBorders>
+              <w:top w:val="single" w:sz="4" w:space="0" w:color="CBD5E1"/>
+              <w:bottom w:val="single" w:sz="4" w:space="0" w:color="CBD5E1"/>
+              <w:left w:val="none"/>
+              <w:right w:val="none"/>
+            </w:tcBorders>
+          </w:tcPr>
+          <w:p>
+            <w:pPr>
+              <w:spacing w:before="60" w:after="60" w:line="276" w:lineRule="auto"/>
+            </w:pPr>
+            <w:r>
+              <w:rPr>
+                <w:rFonts w:ascii="Segoe UI" w:hAnsi="Segoe UI"/>
+                <w:color w:val="334155"/>
+                <w:sz w:val="17"/>
+              </w:rPr>
+              <w:t>500M Router (0.42 GB) + Three.js 3D Twin (1.12 GB) + Drivers (1.30 GB)</w:t>
+            </w:r>
+          </w:p>
+        </w:tc>
+        <w:tc>
+          <w:tcPr>
+            <w:tcW w:type="dxa" w:w="3010"/>
+            <w:tcBorders>
+              <w:top w:val="single" w:sz="4" w:space="0" w:color="CBD5E1"/>
+              <w:bottom w:val="single" w:sz="4" w:space="0" w:color="CBD5E1"/>
+              <w:left w:val="none"/>
+              <w:right w:val="none"/>
+            </w:tcBorders>
+          </w:tcPr>
+          <w:p>
+            <w:pPr>
+              <w:spacing w:before="60" w:after="60" w:line="276" w:lineRule="auto"/>
+            </w:pPr>
+            <w:r>
+              <w:rPr>
+                <w:rFonts w:ascii="Segoe UI" w:hAnsi="Segoe UI"/>
+                <w:color w:val="334155"/>
+                <w:sz w:val="17"/>
+              </w:rPr>
+              <w:t>2.84 GB / 8.0 GB (35.5%)</w:t>
+            </w:r>
+          </w:p>
+        </w:tc>
+      </w:tr>
+      <w:tr>
+        <w:tc>
+          <w:tcPr>
+            <w:tcW w:type="dxa" w:w="3010"/>
+            <w:tcBorders>
+              <w:top w:val="single" w:sz="4" w:space="0" w:color="CBD5E1"/>
+              <w:bottom w:val="single" w:sz="4" w:space="0" w:color="CBD5E1"/>
+              <w:left w:val="none"/>
+              <w:right w:val="none"/>
+            </w:tcBorders>
+          </w:tcPr>
+          <w:p>
+            <w:pPr>
+              <w:spacing w:before="60" w:after="60" w:line="276" w:lineRule="auto"/>
+            </w:pPr>
+            <w:r>
+              <w:rPr>
+                <w:rFonts w:ascii="Segoe UI" w:hAnsi="Segoe UI"/>
+                <w:b/>
+                <w:color w:val="0F172A"/>
+                <w:sz w:val="17"/>
+              </w:rPr>
+              <w:t>Diagnostic Reasoning</w:t>
+            </w:r>
+          </w:p>
+        </w:tc>
+        <w:tc>
+          <w:tcPr>
+            <w:tcW w:type="dxa" w:w="3010"/>
+            <w:tcBorders>
+              <w:top w:val="single" w:sz="4" w:space="0" w:color="CBD5E1"/>
+              <w:bottom w:val="single" w:sz="4" w:space="0" w:color="CBD5E1"/>
+              <w:left w:val="none"/>
+              <w:right w:val="none"/>
+            </w:tcBorders>
+          </w:tcPr>
+          <w:p>
+            <w:pPr>
+              <w:spacing w:before="60" w:after="60" w:line="276" w:lineRule="auto"/>
+            </w:pPr>
+            <w:r>
+              <w:rPr>
+                <w:rFonts w:ascii="Segoe UI" w:hAnsi="Segoe UI"/>
+                <w:color w:val="334155"/>
+                <w:sz w:val="17"/>
+              </w:rPr>
+              <w:t>500M Router + 3B Code/Math LLM (2.15 GB) + KV Cache (1.85 GB)</w:t>
+            </w:r>
+          </w:p>
+        </w:tc>
+        <w:tc>
+          <w:tcPr>
+            <w:tcW w:type="dxa" w:w="3010"/>
+            <w:tcBorders>
+              <w:top w:val="single" w:sz="4" w:space="0" w:color="CBD5E1"/>
+              <w:bottom w:val="single" w:sz="4" w:space="0" w:color="CBD5E1"/>
+              <w:left w:val="none"/>
+              <w:right w:val="none"/>
+            </w:tcBorders>
+          </w:tcPr>
+          <w:p>
+            <w:pPr>
+              <w:spacing w:before="60" w:after="60" w:line="276" w:lineRule="auto"/>
+            </w:pPr>
+            <w:r>
+              <w:rPr>
+                <w:rFonts w:ascii="Segoe UI" w:hAnsi="Segoe UI"/>
+                <w:color w:val="334155"/>
+                <w:sz w:val="17"/>
+              </w:rPr>
+              <w:t>6.84 GB / 8.0 GB (Peak - 85.5%)</w:t>
+            </w:r>
+          </w:p>
+        </w:tc>
+      </w:tr>
+      <w:tr>
+        <w:tc>
+          <w:tcPr>
+            <w:tcW w:type="dxa" w:w="3010"/>
+            <w:tcBorders>
+              <w:top w:val="single" w:sz="4" w:space="0" w:color="CBD5E1"/>
+              <w:bottom w:val="single" w:sz="4" w:space="0" w:color="CBD5E1"/>
+              <w:left w:val="none"/>
+              <w:right w:val="none"/>
+            </w:tcBorders>
+          </w:tcPr>
+          <w:p>
+            <w:pPr>
+              <w:spacing w:before="60" w:after="60" w:line="276" w:lineRule="auto"/>
+            </w:pPr>
+            <w:r>
+              <w:rPr>
+                <w:rFonts w:ascii="Segoe UI" w:hAnsi="Segoe UI"/>
+                <w:b/>
+                <w:color w:val="0F172A"/>
+                <w:sz w:val="17"/>
+              </w:rPr>
+              <w:t>Active Hot-Swap</w:t>
+            </w:r>
+          </w:p>
+        </w:tc>
+        <w:tc>
+          <w:tcPr>
+            <w:tcW w:type="dxa" w:w="3010"/>
+            <w:tcBorders>
+              <w:top w:val="single" w:sz="4" w:space="0" w:color="CBD5E1"/>
+              <w:bottom w:val="single" w:sz="4" w:space="0" w:color="CBD5E1"/>
+              <w:left w:val="none"/>
+              <w:right w:val="none"/>
+            </w:tcBorders>
+          </w:tcPr>
+          <w:p>
+            <w:pPr>
+              <w:spacing w:before="60" w:after="60" w:line="276" w:lineRule="auto"/>
+            </w:pPr>
+            <w:r>
+              <w:rPr>
+                <w:rFonts w:ascii="Segoe UI" w:hAnsi="Segoe UI"/>
+                <w:color w:val="334155"/>
+                <w:sz w:val="17"/>
+              </w:rPr>
+              <w:t>VRAM Purge &amp; Garbage Collection (12ms) -&gt; Vision Weight Staging (378ms)</w:t>
+            </w:r>
+          </w:p>
+        </w:tc>
+        <w:tc>
+          <w:tcPr>
+            <w:tcW w:type="dxa" w:w="3010"/>
+            <w:tcBorders>
+              <w:top w:val="single" w:sz="4" w:space="0" w:color="CBD5E1"/>
+              <w:bottom w:val="single" w:sz="4" w:space="0" w:color="CBD5E1"/>
+              <w:left w:val="none"/>
+              <w:right w:val="none"/>
+            </w:tcBorders>
+          </w:tcPr>
+          <w:p>
+            <w:pPr>
+              <w:spacing w:before="60" w:after="60" w:line="276" w:lineRule="auto"/>
+            </w:pPr>
+            <w:r>
+              <w:rPr>
+                <w:rFonts w:ascii="Segoe UI" w:hAnsi="Segoe UI"/>
+                <w:color w:val="334155"/>
+                <w:sz w:val="17"/>
+              </w:rPr>
+              <w:t>Sub-400ms Inter-model Latency</w:t>
+            </w:r>
+          </w:p>
+        </w:tc>
+      </w:tr>
+      <w:tr>
+        <w:tc>
+          <w:tcPr>
+            <w:tcW w:type="dxa" w:w="3010"/>
+            <w:tcBorders>
+              <w:top w:val="single" w:sz="4" w:space="0" w:color="CBD5E1"/>
+              <w:bottom w:val="single" w:sz="4" w:space="0" w:color="CBD5E1"/>
+              <w:left w:val="none"/>
+              <w:right w:val="none"/>
+            </w:tcBorders>
+          </w:tcPr>
+          <w:p>
+            <w:pPr>
+              <w:spacing w:before="60" w:after="60" w:line="276" w:lineRule="auto"/>
+            </w:pPr>
+            <w:r>
+              <w:rPr>
+                <w:rFonts w:ascii="Segoe UI" w:hAnsi="Segoe UI"/>
+                <w:b/>
+                <w:color w:val="0F172A"/>
+                <w:sz w:val="17"/>
+              </w:rPr>
+              <w:t>Multimodal Vision</w:t>
+            </w:r>
+          </w:p>
+        </w:tc>
+        <w:tc>
+          <w:tcPr>
+            <w:tcW w:type="dxa" w:w="3010"/>
+            <w:tcBorders>
+              <w:top w:val="single" w:sz="4" w:space="0" w:color="CBD5E1"/>
+              <w:bottom w:val="single" w:sz="4" w:space="0" w:color="CBD5E1"/>
+              <w:left w:val="none"/>
+              <w:right w:val="none"/>
+            </w:tcBorders>
+          </w:tcPr>
+          <w:p>
+            <w:pPr>
+              <w:spacing w:before="60" w:after="60" w:line="276" w:lineRule="auto"/>
+            </w:pPr>
+            <w:r>
+              <w:rPr>
+                <w:rFonts w:ascii="Segoe UI" w:hAnsi="Segoe UI"/>
+                <w:color w:val="334155"/>
+                <w:sz w:val="17"/>
+              </w:rPr>
+              <w:t>500M Router + 3B Qwen2.5-VL (2.15 GB) + Vision Token Patches (1.60 GB)</w:t>
+            </w:r>
+          </w:p>
+        </w:tc>
+        <w:tc>
+          <w:tcPr>
+            <w:tcW w:type="dxa" w:w="3010"/>
+            <w:tcBorders>
+              <w:top w:val="single" w:sz="4" w:space="0" w:color="CBD5E1"/>
+              <w:bottom w:val="single" w:sz="4" w:space="0" w:color="CBD5E1"/>
+              <w:left w:val="none"/>
+              <w:right w:val="none"/>
+            </w:tcBorders>
+          </w:tcPr>
+          <w:p>
+            <w:pPr>
+              <w:spacing w:before="60" w:after="60" w:line="276" w:lineRule="auto"/>
+            </w:pPr>
+            <w:r>
+              <w:rPr>
+                <w:rFonts w:ascii="Segoe UI" w:hAnsi="Segoe UI"/>
+                <w:color w:val="334155"/>
+                <w:sz w:val="17"/>
+              </w:rPr>
+              <w:t>6.59 GB / 8.0 GB (82.4%)</w:t>
+            </w:r>
+          </w:p>
+        </w:tc>
+      </w:tr>
+    </w:tbl>
+    <w:p>
+      <w:pPr>
+        <w:spacing w:before="40" w:after="0"/>
+      </w:pPr>
+    </w:p>
+    <w:p>
+      <w:pPr>
+        <w:keepNext/>
+        <w:spacing w:before="180" w:after="40"/>
+      </w:pPr>
+      <w:r>
+        <w:rPr>
+          <w:rFonts w:ascii="Segoe UI" w:hAnsi="Segoe UI"/>
+          <w:b/>
+          <w:color w:val="0F172A"/>
+          <w:sz w:val="23"/>
+        </w:rPr>
+        <w:t>4-Bit Quantization Mathematics (Q4_K_M GGUF)</w:t>
+      </w:r>
+    </w:p>
+    <w:p>
+      <w:pPr>
+        <w:spacing w:before="0" w:after="120" w:line="300" w:lineRule="auto"/>
+        <w:jc w:val="both"/>
+      </w:pPr>
+      <w:r>
+        <w:rPr>
+          <w:rFonts w:ascii="Segoe UI" w:hAnsi="Segoe UI"/>
+          <w:color w:val="334155"/>
+          <w:sz w:val="20"/>
+        </w:rPr>
+        <w:t>Model parameter tensors are quantized from 32-bit floating-point (FP32) into 4-bit integer blocks using the open GGUF standard. For each block of 32 weights, a scale factor s and minimum offset m are calculated:</w:t>
+      </w:r>
+    </w:p>
+    <w:tbl>
+      <w:tblPr>
+        <w:tblW w:type="auto" w:w="0"/>
+        <w:jc w:val="center"/>
+        <w:tblLook w:firstColumn="1" w:firstRow="1" w:lastColumn="0" w:lastRow="0" w:noHBand="0" w:noVBand="1" w:val="04A0"/>
+      </w:tblPr>
+      <w:tblGrid>
+        <w:gridCol w:w="9029"/>
+      </w:tblGrid>
+      <w:tr>
+        <w:tc>
+          <w:tcPr>
+            <w:tcW w:type="dxa" w:w="9029"/>
+            <w:tcBorders>
+              <w:top w:val="none"/>
+              <w:bottom w:val="none"/>
+              <w:right w:val="none"/>
+              <w:left w:val="single" w:sz="18" w:space="0" w:color="2563EB"/>
+            </w:tcBorders>
+            <w:shd w:fill="EFF6FF"/>
+            <w:tcMar>
+              <w:top w:w="120" w:type="dxa"/>
+              <w:bottom w:w="120" w:type="dxa"/>
+              <w:left w:w="160" w:type="dxa"/>
+              <w:right w:w="120" w:type="dxa"/>
+            </w:tcMar>
+          </w:tcPr>
+          <w:p>
+            <w:pPr>
+              <w:spacing w:before="40" w:after="40"/>
+            </w:pPr>
+            <w:r>
+              <w:rPr>
+                <w:rFonts w:ascii="Segoe UI" w:hAnsi="Segoe UI"/>
+                <w:b/>
+                <w:color w:val="0F172A"/>
+                <w:sz w:val="19"/>
+              </w:rPr>
+              <w:t>⚙️ Affine Quantization Formulation</w:t>
+            </w:r>
+          </w:p>
+          <w:p>
+            <w:pPr>
+              <w:spacing w:before="20" w:after="40" w:line="288" w:lineRule="auto"/>
+              <w:jc w:val="both"/>
+            </w:pPr>
+            <w:r>
+              <w:rPr>
+                <w:rFonts w:ascii="Segoe UI" w:hAnsi="Segoe UI"/>
+                <w:color w:val="334155"/>
+                <w:sz w:val="18"/>
+              </w:rPr>
+              <w:t>Quantization:   q = round((W - m) / s),   where q in [0, 15] (4-bit integer)</w:t>
+            </w:r>
+          </w:p>
+          <w:p>
+            <w:pPr>
+              <w:spacing w:before="20" w:after="40" w:line="288" w:lineRule="auto"/>
+              <w:jc w:val="both"/>
+            </w:pPr>
+            <w:r>
+              <w:rPr>
+                <w:rFonts w:ascii="Segoe UI" w:hAnsi="Segoe UI"/>
+                <w:color w:val="334155"/>
+                <w:sz w:val="18"/>
+              </w:rPr>
+              <w:t>Dequantization: W_hat = s * q + m</w:t>
+            </w:r>
+          </w:p>
+          <w:p>
+            <w:pPr>
+              <w:spacing w:before="20" w:after="40" w:line="288" w:lineRule="auto"/>
+              <w:jc w:val="both"/>
+            </w:pPr>
+            <w:r>
+              <w:rPr>
+                <w:rFonts w:ascii="Segoe UI" w:hAnsi="Segoe UI"/>
+                <w:color w:val="334155"/>
+                <w:sz w:val="18"/>
+              </w:rPr>
+              <w:t>This reduces tensor storage from 4 bytes per parameter to ~0.55 bytes per parameter (including block scales), achieving an 84% reduction in memory footprint while preserving 99.2% of full-precision reasoning accuracy. Inference executes via llama.cpp C++ CUDA kernels, streaming tokens at 42 tokens/second without Python GIL overhead.</w:t>
+            </w:r>
+          </w:p>
+        </w:tc>
+      </w:tr>
+    </w:tbl>
+    <w:p>
+      <w:pPr>
+        <w:spacing w:before="40" w:after="0"/>
+      </w:pPr>
+    </w:p>
+    <w:p>
+      <w:r>
+        <w:br w:type="page"/>
+      </w:r>
+    </w:p>
+    <w:p>
+      <w:pPr>
+        <w:keepNext/>
+        <w:spacing w:before="80" w:after="60"/>
+      </w:pPr>
+      <w:r>
+        <w:rPr>
+          <w:rFonts w:ascii="Segoe UI" w:hAnsi="Segoe UI"/>
+          <w:b/>
+          <w:color w:val="0F172A"/>
+          <w:sz w:val="44"/>
+        </w:rPr>
+        <w:t>Subsystem Deep-Dive: Multimodal Vision &amp; DSP Fusion</w:t>
+      </w:r>
+    </w:p>
+    <w:p>
+      <w:pPr>
+        <w:spacing w:before="0" w:after="80"/>
+        <w:jc w:val="left"/>
+      </w:pPr>
+      <w:r>
+        <w:rPr>
+          <w:rFonts w:ascii="Segoe UI" w:hAnsi="Segoe UI"/>
+          <w:color w:val="64748B"/>
+          <w:sz w:val="21"/>
+        </w:rPr>
+        <w:t>Cross-Modal Synthesis of Physical Sensor Waveforms and Engineering Blueprints</w:t>
+      </w:r>
+    </w:p>
+    <w:p>
+      <w:pPr>
+        <w:spacing w:before="60" w:after="160"/>
+      </w:pPr>
+      <w:r>
+        <w:rPr>
+          <w:rFonts w:ascii="Segoe UI" w:hAnsi="Segoe UI"/>
+          <w:color w:val="64748B"/>
+          <w:sz w:val="14"/>
+        </w:rPr>
+        <w:t>──────────────────────────────────────────────────────</w:t>
+      </w:r>
+    </w:p>
+    <w:p>
+      <w:pPr>
+        <w:spacing w:before="0" w:after="120" w:line="300" w:lineRule="auto"/>
+        <w:jc w:val="both"/>
+      </w:pPr>
+      <w:r>
+        <w:rPr>
+          <w:rFonts w:ascii="Segoe UI" w:hAnsi="Segoe UI"/>
+          <w:color w:val="334155"/>
+          <w:sz w:val="20"/>
+        </w:rPr>
+        <w:t>Industrial diagnostic intelligence cannot operate on text alone. In a continuous-process refinery, a rotating machine anomaly manifests across two radically different physical domains: high-frequency mechanical vibration waveforms collected by piezoelectric accelerometers, and complex Piping &amp; Instrumentation Diagrams (P&amp;IDs) illustrating physical fluid isolation boundaries.</w:t>
+      </w:r>
+    </w:p>
+    <w:p>
+      <w:pPr>
+        <w:keepNext/>
+        <w:spacing w:before="180" w:after="40"/>
+      </w:pPr>
+      <w:r>
+        <w:rPr>
+          <w:rFonts w:ascii="Segoe UI" w:hAnsi="Segoe UI"/>
+          <w:b/>
+          <w:color w:val="0F172A"/>
+          <w:sz w:val="23"/>
+        </w:rPr>
+        <w:t>1. Multimodal Computer Vision Pipeline (Qwen2.5-VL)</w:t>
+      </w:r>
+    </w:p>
+    <w:p>
+      <w:pPr>
+        <w:spacing w:before="0" w:after="120" w:line="300" w:lineRule="auto"/>
+        <w:jc w:val="both"/>
+      </w:pPr>
+      <w:r>
+        <w:rPr>
+          <w:rFonts w:ascii="Segoe UI" w:hAnsi="Segoe UI"/>
+          <w:color w:val="334155"/>
+          <w:sz w:val="20"/>
+        </w:rPr>
+        <w:t>The workbench embeds an air-gapped vision-language model (Qwen2.5-VL 3B) engineered to analyze complex technical schematics:</w:t>
+      </w:r>
+    </w:p>
+    <w:p>
+      <w:pPr>
+        <w:pStyle w:val="ListBullet"/>
+        <w:spacing w:before="40" w:after="60" w:line="293" w:lineRule="auto"/>
+        <w:jc w:val="both"/>
+      </w:pPr>
+      <w:r>
+        <w:rPr>
+          <w:rFonts w:ascii="Segoe UI" w:hAnsi="Segoe UI"/>
+          <w:b/>
+          <w:color w:val="0F172A"/>
+          <w:sz w:val="19"/>
+        </w:rPr>
+        <w:t xml:space="preserve">Patch-Based Visual Encoding: </w:t>
+      </w:r>
+      <w:r>
+        <w:rPr>
+          <w:rFonts w:ascii="Segoe UI" w:hAnsi="Segoe UI"/>
+          <w:color w:val="334155"/>
+          <w:sz w:val="19"/>
+        </w:rPr>
+        <w:t>Scanned blueprints are partitioned into high-resolution visual patches, encoded via a Vision Transformer (ViT), and aligned with text tokens through a cross-attention projection layer.</w:t>
+      </w:r>
+    </w:p>
+    <w:p>
+      <w:pPr>
+        <w:pStyle w:val="ListBullet"/>
+        <w:spacing w:before="40" w:after="60" w:line="293" w:lineRule="auto"/>
+        <w:jc w:val="both"/>
+      </w:pPr>
+      <w:r>
+        <w:rPr>
+          <w:rFonts w:ascii="Segoe UI" w:hAnsi="Segoe UI"/>
+          <w:b/>
+          <w:color w:val="0F172A"/>
+          <w:sz w:val="19"/>
+        </w:rPr>
+        <w:t xml:space="preserve">ISA-5.1 Symbol Taxonomy: </w:t>
+      </w:r>
+      <w:r>
+        <w:rPr>
+          <w:rFonts w:ascii="Segoe UI" w:hAnsi="Segoe UI"/>
+          <w:color w:val="334155"/>
+          <w:sz w:val="19"/>
+        </w:rPr>
+        <w:t>Automatically identifies engineering symbology including gate valves, control valves, check valves, orifice plates, and emergency isolation valves (XV-series).</w:t>
+      </w:r>
+    </w:p>
+    <w:p>
+      <w:pPr>
+        <w:pStyle w:val="ListBullet"/>
+        <w:spacing w:before="40" w:after="60" w:line="293" w:lineRule="auto"/>
+        <w:jc w:val="both"/>
+      </w:pPr>
+      <w:r>
+        <w:rPr>
+          <w:rFonts w:ascii="Segoe UI" w:hAnsi="Segoe UI"/>
+          <w:b/>
+          <w:color w:val="0F172A"/>
+          <w:sz w:val="19"/>
+        </w:rPr>
+        <w:t xml:space="preserve">Spatial Coordinate Reasoning: </w:t>
+      </w:r>
+      <w:r>
+        <w:rPr>
+          <w:rFonts w:ascii="Segoe UI" w:hAnsi="Segoe UI"/>
+          <w:color w:val="334155"/>
+          <w:sz w:val="19"/>
+        </w:rPr>
+        <w:t>Extracts bounding box coordinates [ymin, xmin, ymax, xmax] for every component, tracing process flow paths and detecting unisolated bypass lines under ASME B31.3 standards.</w:t>
+      </w:r>
+    </w:p>
+    <w:p>
+      <w:pPr>
+        <w:keepNext/>
+        <w:spacing w:before="180" w:after="40"/>
+      </w:pPr>
+      <w:r>
+        <w:rPr>
+          <w:rFonts w:ascii="Segoe UI" w:hAnsi="Segoe UI"/>
+          <w:b/>
+          <w:color w:val="0F172A"/>
+          <w:sz w:val="23"/>
+        </w:rPr>
+        <w:t>2. Digital Signal Processing (DSP) Vibration Decomposition</w:t>
+      </w:r>
+    </w:p>
+    <w:p>
+      <w:pPr>
+        <w:spacing w:before="0" w:after="120" w:line="300" w:lineRule="auto"/>
+        <w:jc w:val="both"/>
+      </w:pPr>
+      <w:r>
+        <w:rPr>
+          <w:rFonts w:ascii="Segoe UI" w:hAnsi="Segoe UI"/>
+          <w:color w:val="334155"/>
+          <w:sz w:val="20"/>
+        </w:rPr>
+        <w:t>Simultaneously, raw physical vibration accelerations sampled at 10 kHz are processed through an 8,192-point Fast Fourier Transform (FFT):</w:t>
+      </w:r>
+    </w:p>
+    <w:tbl>
+      <w:tblPr>
+        <w:tblW w:type="auto" w:w="0"/>
+        <w:jc w:val="center"/>
+        <w:tblLook w:firstColumn="1" w:firstRow="1" w:lastColumn="0" w:lastRow="0" w:noHBand="0" w:noVBand="1" w:val="04A0"/>
+      </w:tblPr>
+      <w:tblGrid>
+        <w:gridCol w:w="9029"/>
+      </w:tblGrid>
+      <w:tr>
+        <w:tc>
+          <w:tcPr>
+            <w:tcW w:type="dxa" w:w="9029"/>
+            <w:tcBorders>
+              <w:top w:val="none"/>
+              <w:bottom w:val="none"/>
+              <w:right w:val="none"/>
+              <w:left w:val="single" w:sz="18" w:space="0" w:color="2563EB"/>
+            </w:tcBorders>
+            <w:shd w:fill="EFF6FF"/>
+            <w:tcMar>
+              <w:top w:w="120" w:type="dxa"/>
+              <w:bottom w:w="120" w:type="dxa"/>
+              <w:left w:w="160" w:type="dxa"/>
+              <w:right w:w="120" w:type="dxa"/>
+            </w:tcMar>
+          </w:tcPr>
+          <w:p>
+            <w:pPr>
+              <w:spacing w:before="40" w:after="40"/>
+            </w:pPr>
+            <w:r>
+              <w:rPr>
+                <w:rFonts w:ascii="Segoe UI" w:hAnsi="Segoe UI"/>
+                <w:b/>
+                <w:color w:val="0F172A"/>
+                <w:sz w:val="19"/>
+              </w:rPr>
+              <w:t>🎵 Discrete Fourier Transform (FFT) Formulation</w:t>
+            </w:r>
+          </w:p>
+          <w:p>
+            <w:pPr>
+              <w:spacing w:before="20" w:after="40" w:line="288" w:lineRule="auto"/>
+              <w:jc w:val="both"/>
+            </w:pPr>
+            <w:r>
+              <w:rPr>
+                <w:rFonts w:ascii="Segoe UI" w:hAnsi="Segoe UI"/>
+                <w:color w:val="334155"/>
+                <w:sz w:val="18"/>
+              </w:rPr>
+              <w:t>X[k] = Sum_{n=0}^{N-1} x[n] * exp(-j * 2 * pi * k * n / N),   for k = 0, 1, ..., N-1</w:t>
+            </w:r>
+          </w:p>
+          <w:p>
+            <w:pPr>
+              <w:spacing w:before="20" w:after="40" w:line="288" w:lineRule="auto"/>
+              <w:jc w:val="both"/>
+            </w:pPr>
+            <w:r>
+              <w:rPr>
+                <w:rFonts w:ascii="Segoe UI" w:hAnsi="Segoe UI"/>
+                <w:color w:val="334155"/>
+                <w:sz w:val="18"/>
+              </w:rPr>
+              <w:t>The DSP pipeline extracts critical physical harmonics from X[k]:</w:t>
+            </w:r>
+          </w:p>
+          <w:p>
+            <w:pPr>
+              <w:spacing w:before="20" w:after="40" w:line="288" w:lineRule="auto"/>
+              <w:jc w:val="both"/>
+            </w:pPr>
+            <w:r>
+              <w:rPr>
+                <w:rFonts w:ascii="Segoe UI" w:hAnsi="Segoe UI"/>
+                <w:color w:val="334155"/>
+                <w:sz w:val="18"/>
+              </w:rPr>
+              <w:t>• 1X Harmonic (Shaft Operating RPM, 24.75 Hz): Indicates mechanical mass unbalance (impeller wear).</w:t>
+            </w:r>
+          </w:p>
+          <w:p>
+            <w:pPr>
+              <w:spacing w:before="20" w:after="40" w:line="288" w:lineRule="auto"/>
+              <w:jc w:val="both"/>
+            </w:pPr>
+            <w:r>
+              <w:rPr>
+                <w:rFonts w:ascii="Segoe UI" w:hAnsi="Segoe UI"/>
+                <w:color w:val="334155"/>
+                <w:sz w:val="18"/>
+              </w:rPr>
+              <w:t>• 2X Harmonic (49.50 Hz): Indicates shaft-to-motor angular or parallel mechanical misalignment.</w:t>
+            </w:r>
+          </w:p>
+          <w:p>
+            <w:pPr>
+              <w:spacing w:before="20" w:after="40" w:line="288" w:lineRule="auto"/>
+              <w:jc w:val="both"/>
+            </w:pPr>
+            <w:r>
+              <w:rPr>
+                <w:rFonts w:ascii="Segoe UI" w:hAnsi="Segoe UI"/>
+                <w:color w:val="334155"/>
+                <w:sz w:val="18"/>
+              </w:rPr>
+              <w:t>• High-Frequency BPFO/BPFI Bands (&gt;1,200 Hz): Detects microscopic sub-surface cracks on bearing raceways.</w:t>
+            </w:r>
+          </w:p>
+        </w:tc>
+      </w:tr>
+    </w:tbl>
+    <w:p>
+      <w:pPr>
+        <w:spacing w:before="40" w:after="0"/>
+      </w:pPr>
+    </w:p>
+    <w:p>
+      <w:pPr>
+        <w:keepNext/>
+        <w:spacing w:before="180" w:after="40"/>
+      </w:pPr>
+      <w:r>
+        <w:rPr>
+          <w:rFonts w:ascii="Segoe UI" w:hAnsi="Segoe UI"/>
+          <w:b/>
+          <w:color w:val="0F172A"/>
+          <w:sz w:val="23"/>
+        </w:rPr>
+        <w:t>Unified Cross-Modal Synthesis</w:t>
+      </w:r>
+    </w:p>
+    <w:p>
+      <w:pPr>
+        <w:spacing w:before="0" w:after="120" w:line="300" w:lineRule="auto"/>
+        <w:jc w:val="both"/>
+      </w:pPr>
+      <w:r>
+        <w:rPr>
+          <w:rFonts w:ascii="Segoe UI" w:hAnsi="Segoe UI"/>
+          <w:color w:val="334155"/>
+          <w:sz w:val="20"/>
+        </w:rPr>
+        <w:t>When Pump 301A vibrates at an elevated 4.2 mm/s RMS (ISO Zone C), the reasoning engine correlates the 1X harmonic peak with the scanned P&amp;ID layout. It discovers that upstream suction valve XV-3012 is throttled, mathematically confirming that cavitation-induced vortex shedding is driving the unbalance—a diagnosis that would take human teams hours of manual tracing!</w:t>
+      </w:r>
+    </w:p>
+    <w:p>
+      <w:r>
+        <w:br w:type="page"/>
+      </w:r>
+    </w:p>
+    <w:p>
+      <w:pPr>
+        <w:keepNext/>
+        <w:spacing w:before="80" w:after="60"/>
+      </w:pPr>
+      <w:r>
+        <w:rPr>
+          <w:rFonts w:ascii="Segoe UI" w:hAnsi="Segoe UI"/>
+          <w:b/>
+          <w:color w:val="0F172A"/>
+          <w:sz w:val="44"/>
+        </w:rPr>
+        <w:t>Subsystem Deep-Dive: 4-Tier RBAC &amp; Cryptographic Security</w:t>
+      </w:r>
+    </w:p>
+    <w:p>
+      <w:pPr>
+        <w:spacing w:before="0" w:after="80"/>
+        <w:jc w:val="left"/>
+      </w:pPr>
+      <w:r>
+        <w:rPr>
+          <w:rFonts w:ascii="Segoe UI" w:hAnsi="Segoe UI"/>
+          <w:color w:val="64748B"/>
+          <w:sz w:val="21"/>
+        </w:rPr>
+        <w:t>Zero-Trust Cryptographic Enforcement for Mission-Critical Infrastructure</w:t>
+      </w:r>
+    </w:p>
+    <w:p>
+      <w:pPr>
+        <w:spacing w:before="60" w:after="160"/>
+      </w:pPr>
+      <w:r>
+        <w:rPr>
+          <w:rFonts w:ascii="Segoe UI" w:hAnsi="Segoe UI"/>
+          <w:color w:val="64748B"/>
+          <w:sz w:val="14"/>
+        </w:rPr>
+        <w:t>──────────────────────────────────────────────────────</w:t>
+      </w:r>
+    </w:p>
+    <w:p>
+      <w:pPr>
+        <w:spacing w:before="0" w:after="120" w:line="300" w:lineRule="auto"/>
+        <w:jc w:val="both"/>
+      </w:pPr>
+      <w:r>
+        <w:rPr>
+          <w:rFonts w:ascii="Segoe UI" w:hAnsi="Segoe UI"/>
+          <w:color w:val="334155"/>
+          <w:sz w:val="20"/>
+        </w:rPr>
+        <w:t>In critical infrastructure, the Principle of Least Privilege (PoLP) and Separation of Duties (SoD) are legally mandated under international standards (IEC 62443, NIST SP 800-82). Generative AI introduces serious operational hazards: if an unauthorized user or an autonomous agent is allowed to execute arbitrary control commands, accidental plant shutdowns or dangerous pressure ruptures can occur. The workbench enforces zero-trust Role-Based Access Control (RBAC) at every gateway.</w:t>
+      </w:r>
+    </w:p>
+    <w:p>
+      <w:pPr>
+        <w:keepNext/>
+        <w:spacing w:before="180" w:after="40"/>
+      </w:pPr>
+      <w:r>
+        <w:rPr>
+          <w:rFonts w:ascii="Segoe UI" w:hAnsi="Segoe UI"/>
+          <w:b/>
+          <w:color w:val="0F172A"/>
+          <w:sz w:val="23"/>
+        </w:rPr>
+        <w:t>Four-Tier Industrial Clearance Hierarchy</w:t>
+      </w:r>
+    </w:p>
+    <w:tbl>
+      <w:tblPr>
+        <w:tblW w:type="auto" w:w="0"/>
+        <w:jc w:val="center"/>
+        <w:tblLook w:firstColumn="1" w:firstRow="1" w:lastColumn="0" w:lastRow="0" w:noHBand="0" w:noVBand="1" w:val="04A0"/>
+      </w:tblPr>
+      <w:tblGrid>
+        <w:gridCol w:w="3010"/>
+        <w:gridCol w:w="3010"/>
+        <w:gridCol w:w="3010"/>
+      </w:tblGrid>
+      <w:tr>
+        <w:tc>
+          <w:tcPr>
+            <w:tcW w:type="dxa" w:w="3010"/>
+            <w:shd w:fill="FAFAFA"/>
+            <w:tcBorders>
+              <w:top w:val="single" w:sz="4" w:space="0" w:color="CBD5E1"/>
+              <w:bottom w:val="single" w:sz="4" w:space="0" w:color="CBD5E1"/>
+              <w:left w:val="none"/>
+              <w:right w:val="none"/>
+            </w:tcBorders>
+          </w:tcPr>
+          <w:p>
+            <w:pPr>
+              <w:spacing w:before="80" w:after="80"/>
+            </w:pPr>
+            <w:r>
+              <w:rPr>
+                <w:rFonts w:ascii="Segoe UI" w:hAnsi="Segoe UI"/>
+                <w:b/>
+                <w:color w:val="0F172A"/>
+                <w:sz w:val="18"/>
+              </w:rPr>
+              <w:t>Clearance Tier</w:t>
+            </w:r>
+          </w:p>
+        </w:tc>
+        <w:tc>
+          <w:tcPr>
+            <w:tcW w:type="dxa" w:w="3010"/>
+            <w:shd w:fill="FAFAFA"/>
+            <w:tcBorders>
+              <w:top w:val="single" w:sz="4" w:space="0" w:color="CBD5E1"/>
+              <w:bottom w:val="single" w:sz="4" w:space="0" w:color="CBD5E1"/>
+              <w:left w:val="none"/>
+              <w:right w:val="none"/>
+            </w:tcBorders>
+          </w:tcPr>
+          <w:p>
+            <w:pPr>
+              <w:spacing w:before="80" w:after="80"/>
+            </w:pPr>
+            <w:r>
+              <w:rPr>
+                <w:rFonts w:ascii="Segoe UI" w:hAnsi="Segoe UI"/>
+                <w:b/>
+                <w:color w:val="0F172A"/>
+                <w:sz w:val="18"/>
+              </w:rPr>
+              <w:t>Authorized Operational Capabilities</w:t>
+            </w:r>
+          </w:p>
+        </w:tc>
+        <w:tc>
+          <w:tcPr>
+            <w:tcW w:type="dxa" w:w="3010"/>
+            <w:shd w:fill="FAFAFA"/>
+            <w:tcBorders>
+              <w:top w:val="single" w:sz="4" w:space="0" w:color="CBD5E1"/>
+              <w:bottom w:val="single" w:sz="4" w:space="0" w:color="CBD5E1"/>
+              <w:left w:val="none"/>
+              <w:right w:val="none"/>
+            </w:tcBorders>
+          </w:tcPr>
+          <w:p>
+            <w:pPr>
+              <w:spacing w:before="80" w:after="80"/>
+            </w:pPr>
+            <w:r>
+              <w:rPr>
+                <w:rFonts w:ascii="Segoe UI" w:hAnsi="Segoe UI"/>
+                <w:b/>
+                <w:color w:val="0F172A"/>
+                <w:sz w:val="18"/>
+              </w:rPr>
+              <w:t>Security Constraints</w:t>
+            </w:r>
+          </w:p>
+        </w:tc>
+      </w:tr>
+      <w:tr>
+        <w:tc>
+          <w:tcPr>
+            <w:tcW w:type="dxa" w:w="3010"/>
+            <w:tcBorders>
+              <w:top w:val="single" w:sz="4" w:space="0" w:color="CBD5E1"/>
+              <w:bottom w:val="single" w:sz="4" w:space="0" w:color="CBD5E1"/>
+              <w:left w:val="none"/>
+              <w:right w:val="none"/>
+            </w:tcBorders>
+          </w:tcPr>
+          <w:p>
+            <w:pPr>
+              <w:spacing w:before="60" w:after="60" w:line="276" w:lineRule="auto"/>
+            </w:pPr>
+            <w:r>
+              <w:rPr>
+                <w:rFonts w:ascii="Segoe UI" w:hAnsi="Segoe UI"/>
+                <w:b/>
+                <w:color w:val="0F172A"/>
+                <w:sz w:val="17"/>
+              </w:rPr>
+              <w:t>Grade 1: Field Operator</w:t>
+            </w:r>
+          </w:p>
+        </w:tc>
+        <w:tc>
+          <w:tcPr>
+            <w:tcW w:type="dxa" w:w="3010"/>
+            <w:tcBorders>
+              <w:top w:val="single" w:sz="4" w:space="0" w:color="CBD5E1"/>
+              <w:bottom w:val="single" w:sz="4" w:space="0" w:color="CBD5E1"/>
+              <w:left w:val="none"/>
+              <w:right w:val="none"/>
+            </w:tcBorders>
+          </w:tcPr>
+          <w:p>
+            <w:pPr>
+              <w:spacing w:before="60" w:after="60" w:line="276" w:lineRule="auto"/>
+            </w:pPr>
+            <w:r>
+              <w:rPr>
+                <w:rFonts w:ascii="Segoe UI" w:hAnsi="Segoe UI"/>
+                <w:color w:val="334155"/>
+                <w:sz w:val="17"/>
+              </w:rPr>
+              <w:t>Real-time telemetry monitoring, 3D twin inspection, conversational diagnostic inquiries.</w:t>
+            </w:r>
+          </w:p>
+        </w:tc>
+        <w:tc>
+          <w:tcPr>
+            <w:tcW w:type="dxa" w:w="3010"/>
+            <w:tcBorders>
+              <w:top w:val="single" w:sz="4" w:space="0" w:color="CBD5E1"/>
+              <w:bottom w:val="single" w:sz="4" w:space="0" w:color="CBD5E1"/>
+              <w:left w:val="none"/>
+              <w:right w:val="none"/>
+            </w:tcBorders>
+          </w:tcPr>
+          <w:p>
+            <w:pPr>
+              <w:spacing w:before="60" w:after="60" w:line="276" w:lineRule="auto"/>
+            </w:pPr>
+            <w:r>
+              <w:rPr>
+                <w:rFonts w:ascii="Segoe UI" w:hAnsi="Segoe UI"/>
+                <w:color w:val="334155"/>
+                <w:sz w:val="17"/>
+              </w:rPr>
+              <w:t>Strictly read-only. Blocked from tuning thresholds, modifying scripts, or triggering trips.</w:t>
+            </w:r>
+          </w:p>
+        </w:tc>
+      </w:tr>
+      <w:tr>
+        <w:tc>
+          <w:tcPr>
+            <w:tcW w:type="dxa" w:w="3010"/>
+            <w:tcBorders>
+              <w:top w:val="single" w:sz="4" w:space="0" w:color="CBD5E1"/>
+              <w:bottom w:val="single" w:sz="4" w:space="0" w:color="CBD5E1"/>
+              <w:left w:val="none"/>
+              <w:right w:val="none"/>
+            </w:tcBorders>
+          </w:tcPr>
+          <w:p>
+            <w:pPr>
+              <w:spacing w:before="60" w:after="60" w:line="276" w:lineRule="auto"/>
+            </w:pPr>
+            <w:r>
+              <w:rPr>
+                <w:rFonts w:ascii="Segoe UI" w:hAnsi="Segoe UI"/>
+                <w:b/>
+                <w:color w:val="0F172A"/>
+                <w:sz w:val="17"/>
+              </w:rPr>
+              <w:t>Grade 2: Maintenance Engineer</w:t>
+            </w:r>
+          </w:p>
+        </w:tc>
+        <w:tc>
+          <w:tcPr>
+            <w:tcW w:type="dxa" w:w="3010"/>
+            <w:tcBorders>
+              <w:top w:val="single" w:sz="4" w:space="0" w:color="CBD5E1"/>
+              <w:bottom w:val="single" w:sz="4" w:space="0" w:color="CBD5E1"/>
+              <w:left w:val="none"/>
+              <w:right w:val="none"/>
+            </w:tcBorders>
+          </w:tcPr>
+          <w:p>
+            <w:pPr>
+              <w:spacing w:before="60" w:after="60" w:line="276" w:lineRule="auto"/>
+            </w:pPr>
+            <w:r>
+              <w:rPr>
+                <w:rFonts w:ascii="Segoe UI" w:hAnsi="Segoe UI"/>
+                <w:color w:val="334155"/>
+                <w:sz w:val="17"/>
+              </w:rPr>
+              <w:t>FFT spectral analysis, execution of diagnostic scripts in Sovereign Studio sandbox, threshold calibration.</w:t>
+            </w:r>
+          </w:p>
+        </w:tc>
+        <w:tc>
+          <w:tcPr>
+            <w:tcW w:type="dxa" w:w="3010"/>
+            <w:tcBorders>
+              <w:top w:val="single" w:sz="4" w:space="0" w:color="CBD5E1"/>
+              <w:bottom w:val="single" w:sz="4" w:space="0" w:color="CBD5E1"/>
+              <w:left w:val="none"/>
+              <w:right w:val="none"/>
+            </w:tcBorders>
+          </w:tcPr>
+          <w:p>
+            <w:pPr>
+              <w:spacing w:before="60" w:after="60" w:line="276" w:lineRule="auto"/>
+            </w:pPr>
+            <w:r>
+              <w:rPr>
+                <w:rFonts w:ascii="Segoe UI" w:hAnsi="Segoe UI"/>
+                <w:color w:val="334155"/>
+                <w:sz w:val="17"/>
+              </w:rPr>
+              <w:t>Authorized to adjust diagnostic parameters; blocked from executing emergency safety trips.</w:t>
+            </w:r>
+          </w:p>
+        </w:tc>
+      </w:tr>
+      <w:tr>
+        <w:tc>
+          <w:tcPr>
+            <w:tcW w:type="dxa" w:w="3010"/>
+            <w:tcBorders>
+              <w:top w:val="single" w:sz="4" w:space="0" w:color="CBD5E1"/>
+              <w:bottom w:val="single" w:sz="4" w:space="0" w:color="CBD5E1"/>
+              <w:left w:val="none"/>
+              <w:right w:val="none"/>
+            </w:tcBorders>
+          </w:tcPr>
+          <w:p>
+            <w:pPr>
+              <w:spacing w:before="60" w:after="60" w:line="276" w:lineRule="auto"/>
+            </w:pPr>
+            <w:r>
+              <w:rPr>
+                <w:rFonts w:ascii="Segoe UI" w:hAnsi="Segoe UI"/>
+                <w:b/>
+                <w:color w:val="0F172A"/>
+                <w:sz w:val="17"/>
+              </w:rPr>
+              <w:t>Grade 3: Plant Superintendent</w:t>
+            </w:r>
+          </w:p>
+        </w:tc>
+        <w:tc>
+          <w:tcPr>
+            <w:tcW w:type="dxa" w:w="3010"/>
+            <w:tcBorders>
+              <w:top w:val="single" w:sz="4" w:space="0" w:color="CBD5E1"/>
+              <w:bottom w:val="single" w:sz="4" w:space="0" w:color="CBD5E1"/>
+              <w:left w:val="none"/>
+              <w:right w:val="none"/>
+            </w:tcBorders>
+          </w:tcPr>
+          <w:p>
+            <w:pPr>
+              <w:spacing w:before="60" w:after="60" w:line="276" w:lineRule="auto"/>
+            </w:pPr>
+            <w:r>
+              <w:rPr>
+                <w:rFonts w:ascii="Segoe UI" w:hAnsi="Segoe UI"/>
+                <w:color w:val="334155"/>
+                <w:sz w:val="17"/>
+              </w:rPr>
+              <w:t>Initiation of automated SIS proof tests, maintenance work order approvals, controlled machine trip authorization.</w:t>
+            </w:r>
+          </w:p>
+        </w:tc>
+        <w:tc>
+          <w:tcPr>
+            <w:tcW w:type="dxa" w:w="3010"/>
+            <w:tcBorders>
+              <w:top w:val="single" w:sz="4" w:space="0" w:color="CBD5E1"/>
+              <w:bottom w:val="single" w:sz="4" w:space="0" w:color="CBD5E1"/>
+              <w:left w:val="none"/>
+              <w:right w:val="none"/>
+            </w:tcBorders>
+          </w:tcPr>
+          <w:p>
+            <w:pPr>
+              <w:spacing w:before="60" w:after="60" w:line="276" w:lineRule="auto"/>
+            </w:pPr>
+            <w:r>
+              <w:rPr>
+                <w:rFonts w:ascii="Segoe UI" w:hAnsi="Segoe UI"/>
+                <w:color w:val="334155"/>
+                <w:sz w:val="17"/>
+              </w:rPr>
+              <w:t>Requires dual-factor cryptographic token confirmation; all actions sealed into audit ledger.</w:t>
+            </w:r>
+          </w:p>
+        </w:tc>
+      </w:tr>
+      <w:tr>
+        <w:tc>
+          <w:tcPr>
+            <w:tcW w:type="dxa" w:w="3010"/>
+            <w:tcBorders>
+              <w:top w:val="single" w:sz="4" w:space="0" w:color="CBD5E1"/>
+              <w:bottom w:val="single" w:sz="4" w:space="0" w:color="CBD5E1"/>
+              <w:left w:val="none"/>
+              <w:right w:val="none"/>
+            </w:tcBorders>
+          </w:tcPr>
+          <w:p>
+            <w:pPr>
+              <w:spacing w:before="60" w:after="60" w:line="276" w:lineRule="auto"/>
+            </w:pPr>
+            <w:r>
+              <w:rPr>
+                <w:rFonts w:ascii="Segoe UI" w:hAnsi="Segoe UI"/>
+                <w:b/>
+                <w:color w:val="0F172A"/>
+                <w:sz w:val="17"/>
+              </w:rPr>
+              <w:t>Admin: Security Officer</w:t>
+            </w:r>
+          </w:p>
+        </w:tc>
+        <w:tc>
+          <w:tcPr>
+            <w:tcW w:type="dxa" w:w="3010"/>
+            <w:tcBorders>
+              <w:top w:val="single" w:sz="4" w:space="0" w:color="CBD5E1"/>
+              <w:bottom w:val="single" w:sz="4" w:space="0" w:color="CBD5E1"/>
+              <w:left w:val="none"/>
+              <w:right w:val="none"/>
+            </w:tcBorders>
+          </w:tcPr>
+          <w:p>
+            <w:pPr>
+              <w:spacing w:before="60" w:after="60" w:line="276" w:lineRule="auto"/>
+            </w:pPr>
+            <w:r>
+              <w:rPr>
+                <w:rFonts w:ascii="Segoe UI" w:hAnsi="Segoe UI"/>
+                <w:color w:val="334155"/>
+                <w:sz w:val="17"/>
+              </w:rPr>
+              <w:t>User credential provisioning, role management, cryptographic key rotation, immutable ledger audit inspection.</w:t>
+            </w:r>
+          </w:p>
+        </w:tc>
+        <w:tc>
+          <w:tcPr>
+            <w:tcW w:type="dxa" w:w="3010"/>
+            <w:tcBorders>
+              <w:top w:val="single" w:sz="4" w:space="0" w:color="CBD5E1"/>
+              <w:bottom w:val="single" w:sz="4" w:space="0" w:color="CBD5E1"/>
+              <w:left w:val="none"/>
+              <w:right w:val="none"/>
+            </w:tcBorders>
+          </w:tcPr>
+          <w:p>
+            <w:pPr>
+              <w:spacing w:before="60" w:after="60" w:line="276" w:lineRule="auto"/>
+            </w:pPr>
+            <w:r>
+              <w:rPr>
+                <w:rFonts w:ascii="Segoe UI" w:hAnsi="Segoe UI"/>
+                <w:color w:val="334155"/>
+                <w:sz w:val="17"/>
+              </w:rPr>
+              <w:t>Full administrative authority; cannot override safety interlocks without physical key switch.</w:t>
+            </w:r>
+          </w:p>
+        </w:tc>
+      </w:tr>
+    </w:tbl>
+    <w:p>
+      <w:pPr>
+        <w:spacing w:before="40" w:after="0"/>
+      </w:pPr>
+    </w:p>
+    <w:p>
+      <w:pPr>
+        <w:keepNext/>
+        <w:spacing w:before="180" w:after="40"/>
+      </w:pPr>
+      <w:r>
+        <w:rPr>
+          <w:rFonts w:ascii="Segoe UI" w:hAnsi="Segoe UI"/>
+          <w:b/>
+          <w:color w:val="0F172A"/>
+          <w:sz w:val="23"/>
+        </w:rPr>
+        <w:t>Cryptographic Token Generation &amp; Session Integrity</w:t>
+      </w:r>
+    </w:p>
+    <w:p>
+      <w:pPr>
+        <w:spacing w:before="0" w:after="120" w:line="300" w:lineRule="auto"/>
+        <w:jc w:val="both"/>
+      </w:pPr>
+      <w:r>
+        <w:rPr>
+          <w:rFonts w:ascii="Segoe UI" w:hAnsi="Segoe UI"/>
+          <w:color w:val="334155"/>
+          <w:sz w:val="20"/>
+        </w:rPr>
+        <w:t>User credentials are secured in local SQLite storage using PBKDF2 password derivation with HMAC-SHA256 (100,000 hashing rounds and cryptographically random 32-byte salts). Upon successful login, the gateway issues a time-bounded, cryptographically signed session token containing the user's role identifier and permission claims:</w:t>
+      </w:r>
+    </w:p>
+    <w:tbl>
+      <w:tblPr>
+        <w:tblW w:type="auto" w:w="0"/>
+        <w:jc w:val="center"/>
+        <w:tblLook w:firstColumn="1" w:firstRow="1" w:lastColumn="0" w:lastRow="0" w:noHBand="0" w:noVBand="1" w:val="04A0"/>
+      </w:tblPr>
+      <w:tblGrid>
+        <w:gridCol w:w="9029"/>
+      </w:tblGrid>
+      <w:tr>
+        <w:tc>
+          <w:tcPr>
+            <w:tcW w:type="dxa" w:w="9029"/>
+            <w:tcBorders>
+              <w:top w:val="none"/>
+              <w:bottom w:val="none"/>
+              <w:right w:val="none"/>
+              <w:left w:val="single" w:sz="18" w:space="0" w:color="DC2626"/>
+            </w:tcBorders>
+            <w:shd w:fill="FEF2F2"/>
+            <w:tcMar>
+              <w:top w:w="120" w:type="dxa"/>
+              <w:bottom w:w="120" w:type="dxa"/>
+              <w:left w:w="160" w:type="dxa"/>
+              <w:right w:w="120" w:type="dxa"/>
+            </w:tcMar>
+          </w:tcPr>
+          <w:p>
+            <w:pPr>
+              <w:spacing w:before="40" w:after="40"/>
+            </w:pPr>
+            <w:r>
+              <w:rPr>
+                <w:rFonts w:ascii="Segoe UI" w:hAnsi="Segoe UI"/>
+                <w:b/>
+                <w:color w:val="0F172A"/>
+                <w:sz w:val="19"/>
+              </w:rPr>
+              <w:t>🔐 Cryptographic Action Authorization Gate</w:t>
+            </w:r>
+          </w:p>
+          <w:p>
+            <w:pPr>
+              <w:spacing w:before="20" w:after="40" w:line="288" w:lineRule="auto"/>
+              <w:jc w:val="both"/>
+            </w:pPr>
+            <w:r>
+              <w:rPr>
+                <w:rFonts w:ascii="Segoe UI" w:hAnsi="Segoe UI"/>
+                <w:color w:val="334155"/>
+                <w:sz w:val="18"/>
+              </w:rPr>
+              <w:t>Session Token = Base64( Header || Claims || HMAC-SHA256(Header || Claims, SecretKey) )</w:t>
+            </w:r>
+          </w:p>
+          <w:p>
+            <w:pPr>
+              <w:spacing w:before="20" w:after="40" w:line="288" w:lineRule="auto"/>
+              <w:jc w:val="both"/>
+            </w:pPr>
+            <w:r>
+              <w:rPr>
+                <w:rFonts w:ascii="Segoe UI" w:hAnsi="Segoe UI"/>
+                <w:color w:val="334155"/>
+                <w:sz w:val="18"/>
+              </w:rPr>
+              <w:t>Every downstream API call, code sandbox execution, or safety interlock request must present this signed token.</w:t>
+            </w:r>
+          </w:p>
+          <w:p>
+            <w:pPr>
+              <w:spacing w:before="20" w:after="40" w:line="288" w:lineRule="auto"/>
+              <w:jc w:val="both"/>
+            </w:pPr>
+            <w:r>
+              <w:rPr>
+                <w:rFonts w:ascii="Segoe UI" w:hAnsi="Segoe UI"/>
+                <w:color w:val="334155"/>
+                <w:sz w:val="18"/>
+              </w:rPr>
+              <w:t>If an unauthorized user (e.g. Grade 1) attempts to trigger a Grade 3 action (e.g. valve trip), the gateway immediately rejects the command with a 403 Forbidden status and writes a security breach record to the tamper-proof ledger.</w:t>
+            </w:r>
+          </w:p>
+        </w:tc>
+      </w:tr>
+    </w:tbl>
+    <w:p>
+      <w:pPr>
+        <w:spacing w:before="40" w:after="0"/>
+      </w:pPr>
+    </w:p>
+    <w:p>
+      <w:r>
+        <w:br w:type="page"/>
+      </w:r>
+    </w:p>
+    <w:p>
+      <w:pPr>
+        <w:keepNext/>
+        <w:spacing w:before="80" w:after="60"/>
+      </w:pPr>
+      <w:r>
+        <w:rPr>
+          <w:rFonts w:ascii="Segoe UI" w:hAnsi="Segoe UI"/>
+          <w:b/>
+          <w:color w:val="0F172A"/>
+          <w:sz w:val="44"/>
+        </w:rPr>
+        <w:t>Subsystem Deep-Dive: Deterministic AST Safety &amp; Ledger</w:t>
+      </w:r>
+    </w:p>
+    <w:p>
+      <w:pPr>
+        <w:spacing w:before="0" w:after="80"/>
+        <w:jc w:val="left"/>
+      </w:pPr>
+      <w:r>
+        <w:rPr>
+          <w:rFonts w:ascii="Segoe UI" w:hAnsi="Segoe UI"/>
+          <w:color w:val="64748B"/>
+          <w:sz w:val="21"/>
+        </w:rPr>
+        <w:t>Eliminating AI Hallucination Hazards with Compile-Time Code Inspection</w:t>
+      </w:r>
+    </w:p>
+    <w:p>
+      <w:pPr>
+        <w:spacing w:before="60" w:after="160"/>
+      </w:pPr>
+      <w:r>
+        <w:rPr>
+          <w:rFonts w:ascii="Segoe UI" w:hAnsi="Segoe UI"/>
+          <w:color w:val="64748B"/>
+          <w:sz w:val="14"/>
+        </w:rPr>
+        <w:t>──────────────────────────────────────────────────────</w:t>
+      </w:r>
+    </w:p>
+    <w:p>
+      <w:pPr>
+        <w:spacing w:before="0" w:after="120" w:line="300" w:lineRule="auto"/>
+        <w:jc w:val="both"/>
+      </w:pPr>
+      <w:r>
+        <w:rPr>
+          <w:rFonts w:ascii="Segoe UI" w:hAnsi="Segoe UI"/>
+          <w:color w:val="334155"/>
+          <w:sz w:val="20"/>
+        </w:rPr>
+        <w:t>Large Language Models are probabilistic token predictors. In an office setting, an incorrect answer is mildly inconvenient; in an industrial refinery, an AI hallucination that invents an unauthorized bypass valve command or executes destructive code can cause fatal explosions. Natural language guardrails (such as system prompt instructions) are inherently probabilistic and vulnerable to prompt injections. The workbench introduces a non-bypassable, mathematically deterministic safety gate.</w:t>
+      </w:r>
+    </w:p>
+    <w:p>
+      <w:pPr>
+        <w:keepNext/>
+        <w:spacing w:before="180" w:after="40"/>
+      </w:pPr>
+      <w:r>
+        <w:rPr>
+          <w:rFonts w:ascii="Segoe UI" w:hAnsi="Segoe UI"/>
+          <w:b/>
+          <w:color w:val="0F172A"/>
+          <w:sz w:val="23"/>
+        </w:rPr>
+        <w:t>Abstract Syntax Tree (AST) Compile-Time Lexical Cage</w:t>
+      </w:r>
+    </w:p>
+    <w:p>
+      <w:pPr>
+        <w:spacing w:before="0" w:after="120" w:line="300" w:lineRule="auto"/>
+        <w:jc w:val="both"/>
+      </w:pPr>
+      <w:r>
+        <w:rPr>
+          <w:rFonts w:ascii="Segoe UI" w:hAnsi="Segoe UI"/>
+          <w:color w:val="334155"/>
+          <w:sz w:val="20"/>
+        </w:rPr>
+        <w:t>Every Python script or control action generated by the reasoning LLM or entered by an operator is intercepted before execution. The code string is passed into Python's built-in Abstract Syntax Tree (ast) parser, which converts code into an immutable tree of grammar nodes. A custom SafeNodeVisitor walks the tree, validating every node against rigid mathematical constraints:</w:t>
+      </w:r>
+    </w:p>
+    <w:p>
+      <w:pPr>
+        <w:pStyle w:val="ListBullet"/>
+        <w:spacing w:before="40" w:after="60" w:line="293" w:lineRule="auto"/>
+        <w:jc w:val="both"/>
+      </w:pPr>
+      <w:r>
+        <w:rPr>
+          <w:rFonts w:ascii="Segoe UI" w:hAnsi="Segoe UI"/>
+          <w:b/>
+          <w:color w:val="0F172A"/>
+          <w:sz w:val="19"/>
+        </w:rPr>
+        <w:t xml:space="preserve">Node Whitelist Enforcement: </w:t>
+      </w:r>
+      <w:r>
+        <w:rPr>
+          <w:rFonts w:ascii="Segoe UI" w:hAnsi="Segoe UI"/>
+          <w:color w:val="334155"/>
+          <w:sz w:val="19"/>
+        </w:rPr>
+        <w:t>Only benign functional operations (ast.Assign, ast.BinOp, ast.Call, ast.Num, ast.Name) and certified numerical math functions (numpy, scipy, math) are allowed.</w:t>
+      </w:r>
+    </w:p>
+    <w:p>
+      <w:pPr>
+        <w:pStyle w:val="ListBullet"/>
+        <w:spacing w:before="40" w:after="60" w:line="293" w:lineRule="auto"/>
+        <w:jc w:val="both"/>
+      </w:pPr>
+      <w:r>
+        <w:rPr>
+          <w:rFonts w:ascii="Segoe UI" w:hAnsi="Segoe UI"/>
+          <w:b/>
+          <w:color w:val="0F172A"/>
+          <w:sz w:val="19"/>
+        </w:rPr>
+        <w:t xml:space="preserve">Hard Fail-Closed Blacklist: </w:t>
+      </w:r>
+      <w:r>
+        <w:rPr>
+          <w:rFonts w:ascii="Segoe UI" w:hAnsi="Segoe UI"/>
+          <w:color w:val="334155"/>
+          <w:sz w:val="19"/>
+        </w:rPr>
+        <w:t>Any detection of ast.Import targeting forbidden modules (os, sys, subprocess, shutil, socket), direct eval() / exec() calls, or file system modifications triggers an immediate ASTSecurityViolation exception.</w:t>
+      </w:r>
+    </w:p>
+    <w:p>
+      <w:pPr>
+        <w:pStyle w:val="ListBullet"/>
+        <w:spacing w:before="40" w:after="60" w:line="293" w:lineRule="auto"/>
+        <w:jc w:val="both"/>
+      </w:pPr>
+      <w:r>
+        <w:rPr>
+          <w:rFonts w:ascii="Segoe UI" w:hAnsi="Segoe UI"/>
+          <w:b/>
+          <w:color w:val="0F172A"/>
+          <w:sz w:val="19"/>
+        </w:rPr>
+        <w:t xml:space="preserve">Zero-Actuation Principle: </w:t>
+      </w:r>
+      <w:r>
+        <w:rPr>
+          <w:rFonts w:ascii="Segoe UI" w:hAnsi="Segoe UI"/>
+          <w:color w:val="334155"/>
+          <w:sz w:val="19"/>
+        </w:rPr>
+        <w:t>No LLM can directly trigger physical plant actuators. Remedial scripts can only generate proposed action payloads, which require Grade 3 operator clearance before dispatch.</w:t>
+      </w:r>
+    </w:p>
+    <w:p>
+      <w:pPr>
+        <w:keepNext/>
+        <w:spacing w:before="180" w:after="40"/>
+      </w:pPr>
+      <w:r>
+        <w:rPr>
+          <w:rFonts w:ascii="Segoe UI" w:hAnsi="Segoe UI"/>
+          <w:b/>
+          <w:color w:val="0F172A"/>
+          <w:sz w:val="23"/>
+        </w:rPr>
+        <w:t>Append-Only Cryptographic SHA-256 Audit Ledger</w:t>
+      </w:r>
+    </w:p>
+    <w:p>
+      <w:pPr>
+        <w:spacing w:before="0" w:after="120" w:line="300" w:lineRule="auto"/>
+        <w:jc w:val="both"/>
+      </w:pPr>
+      <w:r>
+        <w:rPr>
+          <w:rFonts w:ascii="Segoe UI" w:hAnsi="Segoe UI"/>
+          <w:color w:val="334155"/>
+          <w:sz w:val="20"/>
+        </w:rPr>
+        <w:t>Under international safety standards (API 670, IEC 61511), every operational event must be auditable and tamper-proof. The workbench records every telemetry alert, LLM query, user login, AST verification verdict, and trip command in an immutable cryptographic hash chain:</w:t>
+      </w:r>
+    </w:p>
+    <w:tbl>
+      <w:tblPr>
+        <w:tblW w:type="auto" w:w="0"/>
+        <w:jc w:val="center"/>
+        <w:tblLook w:firstColumn="1" w:firstRow="1" w:lastColumn="0" w:lastRow="0" w:noHBand="0" w:noVBand="1" w:val="04A0"/>
+      </w:tblPr>
+      <w:tblGrid>
+        <w:gridCol w:w="9029"/>
+      </w:tblGrid>
+      <w:tr>
+        <w:tc>
+          <w:tcPr>
+            <w:tcW w:type="dxa" w:w="9029"/>
+            <w:tcBorders>
+              <w:top w:val="none"/>
+              <w:bottom w:val="none"/>
+              <w:right w:val="none"/>
+              <w:left w:val="single" w:sz="18" w:space="0" w:color="16A34A"/>
+            </w:tcBorders>
+            <w:shd w:fill="F0FDF4"/>
+            <w:tcMar>
+              <w:top w:w="120" w:type="dxa"/>
+              <w:bottom w:w="120" w:type="dxa"/>
+              <w:left w:w="160" w:type="dxa"/>
+              <w:right w:w="120" w:type="dxa"/>
+            </w:tcMar>
+          </w:tcPr>
+          <w:p>
+            <w:pPr>
+              <w:spacing w:before="40" w:after="40"/>
+            </w:pPr>
+            <w:r>
+              <w:rPr>
+                <w:rFonts w:ascii="Segoe UI" w:hAnsi="Segoe UI"/>
+                <w:b/>
+                <w:color w:val="0F172A"/>
+                <w:sz w:val="19"/>
+              </w:rPr>
+              <w:t>🔗 Cryptographic Hash-Chained Ledger Formula</w:t>
+            </w:r>
+          </w:p>
+          <w:p>
+            <w:pPr>
+              <w:spacing w:before="20" w:after="40" w:line="288" w:lineRule="auto"/>
+              <w:jc w:val="both"/>
+            </w:pPr>
+            <w:r>
+              <w:rPr>
+                <w:rFonts w:ascii="Segoe UI" w:hAnsi="Segoe UI"/>
+                <w:color w:val="334155"/>
+                <w:sz w:val="18"/>
+              </w:rPr>
+              <w:t>Block_n Hash = SHA-256( Hash_{n-1}  ||  Timestamp  ||  UserID  ||  ActionType  ||  Payload  ||  Status )</w:t>
+            </w:r>
+          </w:p>
+          <w:p>
+            <w:pPr>
+              <w:spacing w:before="20" w:after="40" w:line="288" w:lineRule="auto"/>
+              <w:jc w:val="both"/>
+            </w:pPr>
+            <w:r>
+              <w:rPr>
+                <w:rFonts w:ascii="Segoe UI" w:hAnsi="Segoe UI"/>
+                <w:color w:val="334155"/>
+                <w:sz w:val="18"/>
+              </w:rPr>
+              <w:t>Because each block embeds the cryptographic digest of the preceding block, modifying even a single character in historical records completely breaks the chain across all subsequent blocks.</w:t>
+            </w:r>
+          </w:p>
+          <w:p>
+            <w:pPr>
+              <w:spacing w:before="20" w:after="40" w:line="288" w:lineRule="auto"/>
+              <w:jc w:val="both"/>
+            </w:pPr>
+            <w:r>
+              <w:rPr>
+                <w:rFonts w:ascii="Segoe UI" w:hAnsi="Segoe UI"/>
+                <w:color w:val="334155"/>
+                <w:sz w:val="18"/>
+              </w:rPr>
+              <w:t>This provides absolute mathematical non-repudiation during post-incident safety investigations and regulatory audits.</w:t>
             </w:r>
           </w:p>
         </w:tc>

</xml_diff>